<commit_message>
Requisitos e Diagrama caso de uso (em andamento)
</commit_message>
<xml_diff>
--- a/Requisitos/TabelaRequisitos.docx
+++ b/Requisitos/TabelaRequisitos.docx
@@ -125,7 +125,27 @@
               <w:rPr>
                 <w:rFonts w:ascii="Arial" w:hAnsi="Arial" w:cs="Arial"/>
               </w:rPr>
-              <w:t>[RF001] Prover tela inicial do aplicativo</w:t>
+              <w:t>[RF001</w:t>
+            </w:r>
+            <w:proofErr w:type="gramStart"/>
+            <w:r>
+              <w:rPr>
+                <w:rFonts w:ascii="Arial" w:hAnsi="Arial" w:cs="Arial"/>
+              </w:rPr>
+              <w:t xml:space="preserve">] </w:t>
+            </w:r>
+            <w:r>
+              <w:rPr>
+                <w:rFonts w:ascii="Arial" w:hAnsi="Arial" w:cs="Arial"/>
+              </w:rPr>
+              <w:t>Prover</w:t>
+            </w:r>
+            <w:proofErr w:type="gramEnd"/>
+            <w:r>
+              <w:rPr>
+                <w:rFonts w:ascii="Arial" w:hAnsi="Arial" w:cs="Arial"/>
+              </w:rPr>
+              <w:t xml:space="preserve"> tela de apresentação</w:t>
             </w:r>
           </w:p>
         </w:tc>
@@ -154,98 +174,6 @@
               <w:rPr>
                 <w:rFonts w:ascii="Arial" w:hAnsi="Arial" w:cs="Arial"/>
                 <w:b/>
-              </w:rPr>
-            </w:pPr>
-          </w:p>
-        </w:tc>
-        <w:tc>
-          <w:tcPr>
-            <w:tcW w:w="1305" w:type="dxa"/>
-            <w:shd w:val="clear" w:color="auto" w:fill="auto"/>
-          </w:tcPr>
-          <w:p>
-            <w:pPr>
-              <w:jc w:val="both"/>
-              <w:rPr>
-                <w:rFonts w:ascii="Arial" w:hAnsi="Arial" w:cs="Arial"/>
-                <w:b/>
-              </w:rPr>
-            </w:pPr>
-            <w:r>
-              <w:rPr>
-                <w:rFonts w:ascii="Arial" w:hAnsi="Arial" w:cs="Arial"/>
-              </w:rPr>
-              <w:t>Alta</w:t>
-            </w:r>
-          </w:p>
-        </w:tc>
-      </w:tr>
-      <w:tr>
-        <w:trPr>
-          <w:trHeight w:val="292"/>
-        </w:trPr>
-        <w:tc>
-          <w:tcPr>
-            <w:tcW w:w="2969" w:type="dxa"/>
-            <w:shd w:val="clear" w:color="auto" w:fill="auto"/>
-          </w:tcPr>
-          <w:p>
-            <w:pPr>
-              <w:jc w:val="both"/>
-              <w:rPr>
-                <w:rFonts w:ascii="Arial" w:hAnsi="Arial" w:cs="Arial"/>
-              </w:rPr>
-            </w:pPr>
-            <w:r>
-              <w:rPr>
-                <w:rFonts w:ascii="Arial" w:hAnsi="Arial" w:cs="Arial"/>
-              </w:rPr>
-              <w:t>[RF002] Prover tela de apresentação WEB</w:t>
-            </w:r>
-          </w:p>
-        </w:tc>
-        <w:tc>
-          <w:tcPr>
-            <w:tcW w:w="4334" w:type="dxa"/>
-            <w:shd w:val="clear" w:color="auto" w:fill="auto"/>
-          </w:tcPr>
-          <w:p>
-            <w:pPr>
-              <w:jc w:val="both"/>
-              <w:rPr>
-                <w:rFonts w:ascii="Arial" w:hAnsi="Arial" w:cs="Arial"/>
-              </w:rPr>
-            </w:pPr>
-            <w:r>
-              <w:rPr>
-                <w:rFonts w:ascii="Arial" w:hAnsi="Arial" w:cs="Arial"/>
-              </w:rPr>
-              <w:t xml:space="preserve">A tela de apresentação web conterá informações sobre o funcionamento geral do site. </w:t>
-            </w:r>
-            <w:r>
-              <w:rPr>
-                <w:rFonts w:ascii="Arial" w:hAnsi="Arial" w:cs="Arial"/>
-              </w:rPr>
-              <w:t xml:space="preserve">Além de </w:t>
-            </w:r>
-            <w:r>
-              <w:rPr>
-                <w:rFonts w:ascii="Arial" w:hAnsi="Arial" w:cs="Arial"/>
-              </w:rPr>
-              <w:t>botões para as seguintes telas: login; cadastro; contato; sobre; baixar app; planos</w:t>
-            </w:r>
-            <w:r>
-              <w:rPr>
-                <w:rFonts w:ascii="Arial" w:hAnsi="Arial" w:cs="Arial"/>
-              </w:rPr>
-              <w:t>.</w:t>
-            </w:r>
-          </w:p>
-          <w:p>
-            <w:pPr>
-              <w:jc w:val="both"/>
-              <w:rPr>
-                <w:rFonts w:ascii="Arial" w:hAnsi="Arial" w:cs="Arial"/>
               </w:rPr>
             </w:pPr>
           </w:p>
@@ -297,13 +225,21 @@
               <w:rPr>
                 <w:rFonts w:ascii="Arial" w:hAnsi="Arial" w:cs="Arial"/>
               </w:rPr>
-              <w:t>3</w:t>
-            </w:r>
-            <w:r>
-              <w:rPr>
-                <w:rFonts w:ascii="Arial" w:hAnsi="Arial" w:cs="Arial"/>
-              </w:rPr>
-              <w:t>] Prover tela de cadastro de usuário</w:t>
+              <w:t>2</w:t>
+            </w:r>
+            <w:proofErr w:type="gramStart"/>
+            <w:r>
+              <w:rPr>
+                <w:rFonts w:ascii="Arial" w:hAnsi="Arial" w:cs="Arial"/>
+              </w:rPr>
+              <w:t>] Prover</w:t>
+            </w:r>
+            <w:proofErr w:type="gramEnd"/>
+            <w:r>
+              <w:rPr>
+                <w:rFonts w:ascii="Arial" w:hAnsi="Arial" w:cs="Arial"/>
+              </w:rPr>
+              <w:t xml:space="preserve"> tela de cadastro de usuário</w:t>
             </w:r>
           </w:p>
         </w:tc>
@@ -385,13 +321,21 @@
               <w:rPr>
                 <w:rFonts w:ascii="Arial" w:hAnsi="Arial" w:cs="Arial"/>
               </w:rPr>
-              <w:t>4</w:t>
-            </w:r>
-            <w:r>
-              <w:rPr>
-                <w:rFonts w:ascii="Arial" w:hAnsi="Arial" w:cs="Arial"/>
-              </w:rPr>
-              <w:t>] Verificar informações do cadastro</w:t>
+              <w:t>3</w:t>
+            </w:r>
+            <w:proofErr w:type="gramStart"/>
+            <w:r>
+              <w:rPr>
+                <w:rFonts w:ascii="Arial" w:hAnsi="Arial" w:cs="Arial"/>
+              </w:rPr>
+              <w:t>] Verificar</w:t>
+            </w:r>
+            <w:proofErr w:type="gramEnd"/>
+            <w:r>
+              <w:rPr>
+                <w:rFonts w:ascii="Arial" w:hAnsi="Arial" w:cs="Arial"/>
+              </w:rPr>
+              <w:t xml:space="preserve"> informações do cadastro</w:t>
             </w:r>
           </w:p>
         </w:tc>
@@ -467,13 +411,21 @@
               <w:rPr>
                 <w:rFonts w:ascii="Arial" w:hAnsi="Arial" w:cs="Arial"/>
               </w:rPr>
-              <w:t>5</w:t>
-            </w:r>
-            <w:r>
-              <w:rPr>
-                <w:rFonts w:ascii="Arial" w:hAnsi="Arial" w:cs="Arial"/>
-              </w:rPr>
-              <w:t>] Prover tela de inserir idade</w:t>
+              <w:t>4</w:t>
+            </w:r>
+            <w:proofErr w:type="gramStart"/>
+            <w:r>
+              <w:rPr>
+                <w:rFonts w:ascii="Arial" w:hAnsi="Arial" w:cs="Arial"/>
+              </w:rPr>
+              <w:t>] Prover</w:t>
+            </w:r>
+            <w:proofErr w:type="gramEnd"/>
+            <w:r>
+              <w:rPr>
+                <w:rFonts w:ascii="Arial" w:hAnsi="Arial" w:cs="Arial"/>
+              </w:rPr>
+              <w:t xml:space="preserve"> tela de inserir idade</w:t>
             </w:r>
           </w:p>
         </w:tc>
@@ -549,13 +501,21 @@
               <w:rPr>
                 <w:rFonts w:ascii="Arial" w:hAnsi="Arial" w:cs="Arial"/>
               </w:rPr>
-              <w:t>6</w:t>
-            </w:r>
-            <w:r>
-              <w:rPr>
-                <w:rFonts w:ascii="Arial" w:hAnsi="Arial" w:cs="Arial"/>
-              </w:rPr>
-              <w:t>] Prover tela de login</w:t>
+              <w:t>5</w:t>
+            </w:r>
+            <w:proofErr w:type="gramStart"/>
+            <w:r>
+              <w:rPr>
+                <w:rFonts w:ascii="Arial" w:hAnsi="Arial" w:cs="Arial"/>
+              </w:rPr>
+              <w:t>] Prover</w:t>
+            </w:r>
+            <w:proofErr w:type="gramEnd"/>
+            <w:r>
+              <w:rPr>
+                <w:rFonts w:ascii="Arial" w:hAnsi="Arial" w:cs="Arial"/>
+              </w:rPr>
+              <w:t xml:space="preserve"> tela de login</w:t>
             </w:r>
           </w:p>
         </w:tc>
@@ -631,13 +591,21 @@
               <w:rPr>
                 <w:rFonts w:ascii="Arial" w:hAnsi="Arial" w:cs="Arial"/>
               </w:rPr>
-              <w:t>7</w:t>
-            </w:r>
-            <w:r>
-              <w:rPr>
-                <w:rFonts w:ascii="Arial" w:hAnsi="Arial" w:cs="Arial"/>
-              </w:rPr>
-              <w:t>] Verificar informações de login</w:t>
+              <w:t>6</w:t>
+            </w:r>
+            <w:proofErr w:type="gramStart"/>
+            <w:r>
+              <w:rPr>
+                <w:rFonts w:ascii="Arial" w:hAnsi="Arial" w:cs="Arial"/>
+              </w:rPr>
+              <w:t>] Verificar</w:t>
+            </w:r>
+            <w:proofErr w:type="gramEnd"/>
+            <w:r>
+              <w:rPr>
+                <w:rFonts w:ascii="Arial" w:hAnsi="Arial" w:cs="Arial"/>
+              </w:rPr>
+              <w:t xml:space="preserve"> informações de login</w:t>
             </w:r>
           </w:p>
         </w:tc>
@@ -745,13 +713,21 @@
               <w:rPr>
                 <w:rFonts w:ascii="Arial" w:hAnsi="Arial" w:cs="Arial"/>
               </w:rPr>
-              <w:t>8</w:t>
-            </w:r>
-            <w:r>
-              <w:rPr>
-                <w:rFonts w:ascii="Arial" w:hAnsi="Arial" w:cs="Arial"/>
-              </w:rPr>
-              <w:t>] Prover tela de recuperação de senha</w:t>
+              <w:t>7</w:t>
+            </w:r>
+            <w:proofErr w:type="gramStart"/>
+            <w:r>
+              <w:rPr>
+                <w:rFonts w:ascii="Arial" w:hAnsi="Arial" w:cs="Arial"/>
+              </w:rPr>
+              <w:t>] Prover</w:t>
+            </w:r>
+            <w:proofErr w:type="gramEnd"/>
+            <w:r>
+              <w:rPr>
+                <w:rFonts w:ascii="Arial" w:hAnsi="Arial" w:cs="Arial"/>
+              </w:rPr>
+              <w:t xml:space="preserve"> tela de recuperação de senha</w:t>
             </w:r>
             <w:r>
               <w:rPr>
@@ -826,6 +802,90 @@
               </w:rPr>
               <w:t>. Mensagem de confirmação será exibida após envio.</w:t>
             </w:r>
+          </w:p>
+        </w:tc>
+        <w:tc>
+          <w:tcPr>
+            <w:tcW w:w="1305" w:type="dxa"/>
+          </w:tcPr>
+          <w:p>
+            <w:pPr>
+              <w:jc w:val="both"/>
+              <w:rPr>
+                <w:rFonts w:ascii="Arial" w:hAnsi="Arial" w:cs="Arial"/>
+              </w:rPr>
+            </w:pPr>
+            <w:r>
+              <w:rPr>
+                <w:rFonts w:ascii="Arial" w:hAnsi="Arial" w:cs="Arial"/>
+              </w:rPr>
+              <w:t>Alta</w:t>
+            </w:r>
+          </w:p>
+        </w:tc>
+      </w:tr>
+      <w:tr>
+        <w:trPr>
+          <w:trHeight w:val="850"/>
+        </w:trPr>
+        <w:tc>
+          <w:tcPr>
+            <w:tcW w:w="2969" w:type="dxa"/>
+          </w:tcPr>
+          <w:p>
+            <w:pPr>
+              <w:jc w:val="both"/>
+              <w:rPr>
+                <w:rFonts w:ascii="Arial" w:hAnsi="Arial" w:cs="Arial"/>
+              </w:rPr>
+            </w:pPr>
+            <w:r>
+              <w:rPr>
+                <w:rFonts w:ascii="Arial" w:hAnsi="Arial" w:cs="Arial"/>
+              </w:rPr>
+              <w:t>[RF008</w:t>
+            </w:r>
+            <w:proofErr w:type="gramStart"/>
+            <w:r>
+              <w:rPr>
+                <w:rFonts w:ascii="Arial" w:hAnsi="Arial" w:cs="Arial"/>
+              </w:rPr>
+              <w:t xml:space="preserve">] </w:t>
+            </w:r>
+            <w:r>
+              <w:rPr>
+                <w:rFonts w:ascii="Arial" w:hAnsi="Arial" w:cs="Arial"/>
+              </w:rPr>
+              <w:t>Enviar</w:t>
+            </w:r>
+            <w:proofErr w:type="gramEnd"/>
+            <w:r>
+              <w:rPr>
+                <w:rFonts w:ascii="Arial" w:hAnsi="Arial" w:cs="Arial"/>
+              </w:rPr>
+              <w:t xml:space="preserve"> código para </w:t>
+            </w:r>
+            <w:proofErr w:type="spellStart"/>
+            <w:r>
+              <w:rPr>
+                <w:rFonts w:ascii="Arial" w:hAnsi="Arial" w:cs="Arial"/>
+              </w:rPr>
+              <w:t>email</w:t>
+            </w:r>
+            <w:proofErr w:type="spellEnd"/>
+          </w:p>
+        </w:tc>
+        <w:tc>
+          <w:tcPr>
+            <w:tcW w:w="4334" w:type="dxa"/>
+          </w:tcPr>
+          <w:p>
+            <w:pPr>
+              <w:jc w:val="both"/>
+              <w:rPr>
+                <w:rFonts w:ascii="Arial" w:hAnsi="Arial" w:cs="Arial"/>
+              </w:rPr>
+            </w:pPr>
           </w:p>
         </w:tc>
         <w:tc>
@@ -876,11 +936,19 @@
               </w:rPr>
               <w:t>9</w:t>
             </w:r>
-            <w:r>
-              <w:rPr>
-                <w:rFonts w:ascii="Arial" w:hAnsi="Arial" w:cs="Arial"/>
-              </w:rPr>
-              <w:t>] Prover tela de recuperação de senha: Código</w:t>
+            <w:proofErr w:type="gramStart"/>
+            <w:r>
+              <w:rPr>
+                <w:rFonts w:ascii="Arial" w:hAnsi="Arial" w:cs="Arial"/>
+              </w:rPr>
+              <w:t>] Prover</w:t>
+            </w:r>
+            <w:proofErr w:type="gramEnd"/>
+            <w:r>
+              <w:rPr>
+                <w:rFonts w:ascii="Arial" w:hAnsi="Arial" w:cs="Arial"/>
+              </w:rPr>
+              <w:t xml:space="preserve"> tela de recuperação de senha: Código</w:t>
             </w:r>
           </w:p>
         </w:tc>
@@ -980,7 +1048,25 @@
               <w:rPr>
                 <w:rFonts w:ascii="Arial" w:hAnsi="Arial" w:cs="Arial"/>
               </w:rPr>
-              <w:t>] Prover tela de recuperação de senha: Nova senha</w:t>
+              <w:t xml:space="preserve">] </w:t>
+            </w:r>
+            <w:r>
+              <w:rPr>
+                <w:rFonts w:ascii="Arial" w:hAnsi="Arial" w:cs="Arial"/>
+              </w:rPr>
+              <w:t xml:space="preserve">autenticar </w:t>
+            </w:r>
+            <w:r>
+              <w:rPr>
+                <w:rFonts w:ascii="Arial" w:hAnsi="Arial" w:cs="Arial"/>
+              </w:rPr>
+              <w:t>código</w:t>
+            </w:r>
+            <w:r>
+              <w:rPr>
+                <w:rFonts w:ascii="Arial" w:hAnsi="Arial" w:cs="Arial"/>
+              </w:rPr>
+              <w:t xml:space="preserve"> enviado para e-mail</w:t>
             </w:r>
           </w:p>
         </w:tc>
@@ -995,68 +1081,6 @@
                 <w:rFonts w:ascii="Arial" w:hAnsi="Arial" w:cs="Arial"/>
               </w:rPr>
             </w:pPr>
-            <w:r>
-              <w:rPr>
-                <w:rFonts w:ascii="Arial" w:hAnsi="Arial" w:cs="Arial"/>
-              </w:rPr>
-              <w:t>Permitir que o usuário recupere a senha através de três etapas, a terceira, Nova senha: O usuário será direcionado a tela de nova senha depois da confirmação do código. Haverá campos de “nova senha” e “Confirmar nova senha”</w:t>
-            </w:r>
-            <w:r>
-              <w:rPr>
-                <w:rFonts w:ascii="Arial" w:hAnsi="Arial" w:cs="Arial"/>
-              </w:rPr>
-              <w:t xml:space="preserve">, </w:t>
-            </w:r>
-            <w:r>
-              <w:rPr>
-                <w:rFonts w:ascii="Arial" w:hAnsi="Arial" w:cs="Arial"/>
-              </w:rPr>
-              <w:t xml:space="preserve">além do botão </w:t>
-            </w:r>
-            <w:r>
-              <w:rPr>
-                <w:rFonts w:ascii="Arial" w:hAnsi="Arial" w:cs="Arial"/>
-              </w:rPr>
-              <w:t>“</w:t>
-            </w:r>
-            <w:r>
-              <w:rPr>
-                <w:rFonts w:ascii="Arial" w:hAnsi="Arial" w:cs="Arial"/>
-              </w:rPr>
-              <w:t>confirmar</w:t>
-            </w:r>
-            <w:r>
-              <w:rPr>
-                <w:rFonts w:ascii="Arial" w:hAnsi="Arial" w:cs="Arial"/>
-              </w:rPr>
-              <w:t>”</w:t>
-            </w:r>
-            <w:r>
-              <w:rPr>
-                <w:rFonts w:ascii="Arial" w:hAnsi="Arial" w:cs="Arial"/>
-              </w:rPr>
-              <w:t xml:space="preserve"> onde ao ser clicado a senha do usuário será redefinida</w:t>
-            </w:r>
-            <w:r>
-              <w:rPr>
-                <w:rFonts w:ascii="Arial" w:hAnsi="Arial" w:cs="Arial"/>
-              </w:rPr>
-              <w:t>. a senha deve ter no mínimo 8 caracteres alfanuméricos, sem espaços ou caracteres especiais. Um aviso será exibido caso algum campo esteja incorreto ou vazio</w:t>
-            </w:r>
-            <w:r>
-              <w:rPr>
-                <w:rFonts w:ascii="Arial" w:hAnsi="Arial" w:cs="Arial"/>
-              </w:rPr>
-              <w:t>.</w:t>
-            </w:r>
-          </w:p>
-          <w:p>
-            <w:pPr>
-              <w:jc w:val="both"/>
-              <w:rPr>
-                <w:rFonts w:ascii="Arial" w:hAnsi="Arial" w:cs="Arial"/>
-              </w:rPr>
-            </w:pPr>
           </w:p>
         </w:tc>
         <w:tc>
@@ -1070,12 +1094,6 @@
                 <w:rFonts w:ascii="Arial" w:hAnsi="Arial" w:cs="Arial"/>
               </w:rPr>
             </w:pPr>
-            <w:r>
-              <w:rPr>
-                <w:rFonts w:ascii="Arial" w:hAnsi="Arial" w:cs="Arial"/>
-              </w:rPr>
-              <w:t>Alta</w:t>
-            </w:r>
           </w:p>
         </w:tc>
       </w:tr>
@@ -1098,7 +1116,7 @@
               <w:rPr>
                 <w:rFonts w:ascii="Arial" w:hAnsi="Arial" w:cs="Arial"/>
               </w:rPr>
-              <w:t>[RF01</w:t>
+              <w:t>[RF0</w:t>
             </w:r>
             <w:r>
               <w:rPr>
@@ -1110,25 +1128,21 @@
               <w:rPr>
                 <w:rFonts w:ascii="Arial" w:hAnsi="Arial" w:cs="Arial"/>
               </w:rPr>
-              <w:t xml:space="preserve">] </w:t>
-            </w:r>
-            <w:r>
-              <w:rPr>
-                <w:rFonts w:ascii="Arial" w:hAnsi="Arial" w:cs="Arial"/>
-              </w:rPr>
-              <w:t>Prover tela inicial</w:t>
-            </w:r>
-            <w:r>
-              <w:rPr>
-                <w:rFonts w:ascii="Arial" w:hAnsi="Arial" w:cs="Arial"/>
-              </w:rPr>
-              <w:t xml:space="preserve"> de login</w:t>
-            </w:r>
-            <w:r>
-              <w:rPr>
-                <w:rFonts w:ascii="Arial" w:hAnsi="Arial" w:cs="Arial"/>
-              </w:rPr>
-              <w:t xml:space="preserve"> do usuário</w:t>
+              <w:t>1</w:t>
+            </w:r>
+            <w:proofErr w:type="gramStart"/>
+            <w:r>
+              <w:rPr>
+                <w:rFonts w:ascii="Arial" w:hAnsi="Arial" w:cs="Arial"/>
+              </w:rPr>
+              <w:t>] Prover</w:t>
+            </w:r>
+            <w:proofErr w:type="gramEnd"/>
+            <w:r>
+              <w:rPr>
+                <w:rFonts w:ascii="Arial" w:hAnsi="Arial" w:cs="Arial"/>
+              </w:rPr>
+              <w:t xml:space="preserve"> tela de recuperação de senha: Nova senha</w:t>
             </w:r>
           </w:p>
         </w:tc>
@@ -1147,7 +1161,49 @@
               <w:rPr>
                 <w:rFonts w:ascii="Arial" w:hAnsi="Arial" w:cs="Arial"/>
               </w:rPr>
-              <w:t>A tela inicial vai funcionar como painel principal do sistema. Ela mostrará uma saudação com o nome do usuário, resumo do progresso e botões para acessar Redação, Modelos, Desempenho, Histórico, Acervo e Configurações</w:t>
+              <w:t>Permitir que o usuário recupere a senha através de três etapas, a terceira, Nova senha: O usuário será direcionado a tela de nova senha depois da confirmação do código. Haverá campos de “nova senha” e “Confirmar nova senha”</w:t>
+            </w:r>
+            <w:r>
+              <w:rPr>
+                <w:rFonts w:ascii="Arial" w:hAnsi="Arial" w:cs="Arial"/>
+              </w:rPr>
+              <w:t xml:space="preserve">, </w:t>
+            </w:r>
+            <w:r>
+              <w:rPr>
+                <w:rFonts w:ascii="Arial" w:hAnsi="Arial" w:cs="Arial"/>
+              </w:rPr>
+              <w:t xml:space="preserve">além do botão </w:t>
+            </w:r>
+            <w:r>
+              <w:rPr>
+                <w:rFonts w:ascii="Arial" w:hAnsi="Arial" w:cs="Arial"/>
+              </w:rPr>
+              <w:t>“</w:t>
+            </w:r>
+            <w:r>
+              <w:rPr>
+                <w:rFonts w:ascii="Arial" w:hAnsi="Arial" w:cs="Arial"/>
+              </w:rPr>
+              <w:t>confirmar</w:t>
+            </w:r>
+            <w:r>
+              <w:rPr>
+                <w:rFonts w:ascii="Arial" w:hAnsi="Arial" w:cs="Arial"/>
+              </w:rPr>
+              <w:t>”</w:t>
+            </w:r>
+            <w:r>
+              <w:rPr>
+                <w:rFonts w:ascii="Arial" w:hAnsi="Arial" w:cs="Arial"/>
+              </w:rPr>
+              <w:t xml:space="preserve"> onde ao ser clicado a senha do usuário será redefinida</w:t>
+            </w:r>
+            <w:r>
+              <w:rPr>
+                <w:rFonts w:ascii="Arial" w:hAnsi="Arial" w:cs="Arial"/>
+              </w:rPr>
+              <w:t>. a senha deve ter no mínimo 8 caracteres alfanuméricos, sem espaços ou caracteres especiais. Um aviso será exibido caso algum campo esteja incorreto ou vazio</w:t>
             </w:r>
             <w:r>
               <w:rPr>
@@ -1210,8 +1266,9 @@
               <w:rPr>
                 <w:rFonts w:ascii="Arial" w:hAnsi="Arial" w:cs="Arial"/>
               </w:rPr>
-              <w:t>3</w:t>
-            </w:r>
+              <w:t>2</w:t>
+            </w:r>
+            <w:proofErr w:type="gramStart"/>
             <w:r>
               <w:rPr>
                 <w:rFonts w:ascii="Arial" w:hAnsi="Arial" w:cs="Arial"/>
@@ -1222,7 +1279,26 @@
               <w:rPr>
                 <w:rFonts w:ascii="Arial" w:hAnsi="Arial" w:cs="Arial"/>
               </w:rPr>
-              <w:t xml:space="preserve"> Prover tela de perfil do usuário</w:t>
+              <w:t>Prover</w:t>
+            </w:r>
+            <w:proofErr w:type="gramEnd"/>
+            <w:r>
+              <w:rPr>
+                <w:rFonts w:ascii="Arial" w:hAnsi="Arial" w:cs="Arial"/>
+              </w:rPr>
+              <w:t xml:space="preserve"> tela inicial</w:t>
+            </w:r>
+            <w:r>
+              <w:rPr>
+                <w:rFonts w:ascii="Arial" w:hAnsi="Arial" w:cs="Arial"/>
+              </w:rPr>
+              <w:t xml:space="preserve"> </w:t>
+            </w:r>
+            <w:r>
+              <w:rPr>
+                <w:rFonts w:ascii="Arial" w:hAnsi="Arial" w:cs="Arial"/>
+              </w:rPr>
+              <w:t>do usuário</w:t>
             </w:r>
           </w:p>
         </w:tc>
@@ -1241,49 +1317,13 @@
               <w:rPr>
                 <w:rFonts w:ascii="Arial" w:hAnsi="Arial" w:cs="Arial"/>
               </w:rPr>
-              <w:t>Mostra para o usuário os dados do seu perfil como nome e e-mail</w:t>
-            </w:r>
-            <w:r>
-              <w:rPr>
-                <w:rFonts w:ascii="Arial" w:hAnsi="Arial" w:cs="Arial"/>
-              </w:rPr>
-              <w:t>. Além de botões</w:t>
-            </w:r>
-            <w:r>
-              <w:rPr>
-                <w:rFonts w:ascii="Arial" w:hAnsi="Arial" w:cs="Arial"/>
-              </w:rPr>
-              <w:t xml:space="preserve"> de alteração de </w:t>
-            </w:r>
-            <w:r>
-              <w:rPr>
-                <w:rFonts w:ascii="Arial" w:hAnsi="Arial" w:cs="Arial"/>
-              </w:rPr>
-              <w:t>e-mail</w:t>
-            </w:r>
-            <w:r>
-              <w:rPr>
-                <w:rFonts w:ascii="Arial" w:hAnsi="Arial" w:cs="Arial"/>
-              </w:rPr>
-              <w:t xml:space="preserve"> e senha</w:t>
-            </w:r>
-            <w:r>
-              <w:rPr>
-                <w:rFonts w:ascii="Arial" w:hAnsi="Arial" w:cs="Arial"/>
-              </w:rPr>
-              <w:t xml:space="preserve"> e exclusão da conta </w:t>
-            </w:r>
-            <w:r>
-              <w:rPr>
-                <w:rFonts w:ascii="Arial" w:hAnsi="Arial" w:cs="Arial"/>
-              </w:rPr>
-              <w:t xml:space="preserve"> estarão </w:t>
-            </w:r>
-            <w:r>
-              <w:rPr>
-                <w:rFonts w:ascii="Arial" w:hAnsi="Arial" w:cs="Arial"/>
-              </w:rPr>
-              <w:t>disponível</w:t>
+              <w:t>A tela inicial vai funcionar como painel principal do sistema. Ela mostrará uma saudação com o nome do usuário, resumo do progresso e botões para acessar Redação, Modelos, Desempenho, Histórico, Acervo e Configurações</w:t>
+            </w:r>
+            <w:r>
+              <w:rPr>
+                <w:rFonts w:ascii="Arial" w:hAnsi="Arial" w:cs="Arial"/>
+              </w:rPr>
+              <w:t>.</w:t>
             </w:r>
           </w:p>
           <w:p>
@@ -1342,17 +1382,37 @@
               </w:rPr>
               <w:t>3</w:t>
             </w:r>
-            <w:r>
-              <w:rPr>
-                <w:rFonts w:ascii="Arial" w:hAnsi="Arial" w:cs="Arial"/>
-              </w:rPr>
-              <w:t>]</w:t>
-            </w:r>
-            <w:r>
-              <w:rPr>
-                <w:rFonts w:ascii="Arial" w:hAnsi="Arial" w:cs="Arial"/>
-              </w:rPr>
-              <w:t xml:space="preserve"> Prover tela de exibição de Modelos de Redação</w:t>
+            <w:proofErr w:type="gramStart"/>
+            <w:r>
+              <w:rPr>
+                <w:rFonts w:ascii="Arial" w:hAnsi="Arial" w:cs="Arial"/>
+              </w:rPr>
+              <w:t xml:space="preserve">] </w:t>
+            </w:r>
+            <w:r>
+              <w:rPr>
+                <w:rFonts w:ascii="Helvetica" w:hAnsi="Helvetica" w:cs="Helvetica"/>
+                <w:color w:val="000000"/>
+                <w:shd w:val="clear" w:color="auto" w:fill="ECECEC"/>
+              </w:rPr>
+              <w:t>Carregar</w:t>
+            </w:r>
+            <w:proofErr w:type="gramEnd"/>
+            <w:r>
+              <w:rPr>
+                <w:rFonts w:ascii="Helvetica" w:hAnsi="Helvetica" w:cs="Helvetica"/>
+                <w:color w:val="000000"/>
+                <w:shd w:val="clear" w:color="auto" w:fill="ECECEC"/>
+              </w:rPr>
+              <w:t xml:space="preserve"> </w:t>
+            </w:r>
+            <w:r>
+              <w:rPr>
+                <w:rFonts w:ascii="Helvetica" w:hAnsi="Helvetica" w:cs="Helvetica"/>
+                <w:color w:val="000000"/>
+                <w:shd w:val="clear" w:color="auto" w:fill="ECECEC"/>
+              </w:rPr>
+              <w:t>configurações salvas do usuário no banco de dados</w:t>
             </w:r>
           </w:p>
         </w:tc>
@@ -1369,21 +1429,11 @@
             </w:pPr>
             <w:r>
               <w:rPr>
-                <w:rFonts w:ascii="Arial" w:hAnsi="Arial" w:cs="Arial"/>
-              </w:rPr>
-              <w:t>Tela que mostrará uma lista de modelos de redação, exibindo título e resumo de cada um. O usuário poderá clicar em cada modelo para visualizar o conteúdo completo. A tela terá botões para salvar modelos em favoritos</w:t>
-            </w:r>
-            <w:r>
-              <w:rPr>
-                <w:rFonts w:ascii="Arial" w:hAnsi="Arial" w:cs="Arial"/>
-              </w:rPr>
-              <w:t>, seleção de categorias</w:t>
-            </w:r>
-            <w:r>
-              <w:rPr>
-                <w:rFonts w:ascii="Arial" w:hAnsi="Arial" w:cs="Arial"/>
-              </w:rPr>
-              <w:t xml:space="preserve"> e voltar à tela anterior.</w:t>
+                <w:rFonts w:ascii="Helvetica" w:hAnsi="Helvetica" w:cs="Helvetica"/>
+                <w:color w:val="000000"/>
+                <w:shd w:val="clear" w:color="auto" w:fill="ECECEC"/>
+              </w:rPr>
+              <w:t>Buscar configurações salvas do usuário no banco de dados</w:t>
             </w:r>
           </w:p>
         </w:tc>
@@ -1400,9 +1450,11 @@
             </w:pPr>
             <w:r>
               <w:rPr>
-                <w:rFonts w:ascii="Arial" w:hAnsi="Arial" w:cs="Arial"/>
-              </w:rPr>
-              <w:t>Media</w:t>
+                <w:rFonts w:ascii="Helvetica" w:hAnsi="Helvetica" w:cs="Helvetica"/>
+                <w:color w:val="000000"/>
+                <w:shd w:val="clear" w:color="auto" w:fill="ECECEC"/>
+              </w:rPr>
+              <w:t>Média</w:t>
             </w:r>
           </w:p>
         </w:tc>
@@ -1434,11 +1486,25 @@
               </w:rPr>
               <w:t>4</w:t>
             </w:r>
-            <w:r>
-              <w:rPr>
-                <w:rFonts w:ascii="Arial" w:hAnsi="Arial" w:cs="Arial"/>
-              </w:rPr>
-              <w:t>] Prover tela de visualização de modelo selecionado</w:t>
+            <w:proofErr w:type="gramStart"/>
+            <w:r>
+              <w:rPr>
+                <w:rFonts w:ascii="Arial" w:hAnsi="Arial" w:cs="Arial"/>
+              </w:rPr>
+              <w:t xml:space="preserve">] </w:t>
+            </w:r>
+            <w:r>
+              <w:rPr>
+                <w:rFonts w:ascii="Arial" w:hAnsi="Arial" w:cs="Arial"/>
+              </w:rPr>
+              <w:t xml:space="preserve"> Prover</w:t>
+            </w:r>
+            <w:proofErr w:type="gramEnd"/>
+            <w:r>
+              <w:rPr>
+                <w:rFonts w:ascii="Arial" w:hAnsi="Arial" w:cs="Arial"/>
+              </w:rPr>
+              <w:t xml:space="preserve"> tela de perfil do usuário</w:t>
             </w:r>
           </w:p>
         </w:tc>
@@ -1457,13 +1523,63 @@
               <w:rPr>
                 <w:rFonts w:ascii="Arial" w:hAnsi="Arial" w:cs="Arial"/>
               </w:rPr>
-              <w:t xml:space="preserve">Tela que exibirá o título, tema e texto completo do modelo de redação. Além da opção de </w:t>
-            </w:r>
-            <w:r>
-              <w:rPr>
-                <w:rFonts w:ascii="Arial" w:hAnsi="Arial" w:cs="Arial"/>
-              </w:rPr>
-              <w:t>voltar à tela anterior.</w:t>
+              <w:t>Mostra para o usuário os dados do seu perfil como nome e e-mail</w:t>
+            </w:r>
+            <w:r>
+              <w:rPr>
+                <w:rFonts w:ascii="Arial" w:hAnsi="Arial" w:cs="Arial"/>
+              </w:rPr>
+              <w:t>. Além de botões</w:t>
+            </w:r>
+            <w:r>
+              <w:rPr>
+                <w:rFonts w:ascii="Arial" w:hAnsi="Arial" w:cs="Arial"/>
+              </w:rPr>
+              <w:t xml:space="preserve"> de alteração de </w:t>
+            </w:r>
+            <w:r>
+              <w:rPr>
+                <w:rFonts w:ascii="Arial" w:hAnsi="Arial" w:cs="Arial"/>
+              </w:rPr>
+              <w:t>e-mail</w:t>
+            </w:r>
+            <w:r>
+              <w:rPr>
+                <w:rFonts w:ascii="Arial" w:hAnsi="Arial" w:cs="Arial"/>
+              </w:rPr>
+              <w:t xml:space="preserve"> e senha</w:t>
+            </w:r>
+            <w:r>
+              <w:rPr>
+                <w:rFonts w:ascii="Arial" w:hAnsi="Arial" w:cs="Arial"/>
+              </w:rPr>
+              <w:t xml:space="preserve"> e exclusão da </w:t>
+            </w:r>
+            <w:proofErr w:type="gramStart"/>
+            <w:r>
+              <w:rPr>
+                <w:rFonts w:ascii="Arial" w:hAnsi="Arial" w:cs="Arial"/>
+              </w:rPr>
+              <w:t xml:space="preserve">conta </w:t>
+            </w:r>
+            <w:r>
+              <w:rPr>
+                <w:rFonts w:ascii="Arial" w:hAnsi="Arial" w:cs="Arial"/>
+              </w:rPr>
+              <w:t xml:space="preserve"> estarão</w:t>
+            </w:r>
+            <w:proofErr w:type="gramEnd"/>
+            <w:r>
+              <w:rPr>
+                <w:rFonts w:ascii="Arial" w:hAnsi="Arial" w:cs="Arial"/>
+              </w:rPr>
+              <w:t xml:space="preserve"> </w:t>
+            </w:r>
+            <w:r>
+              <w:rPr>
+                <w:rFonts w:ascii="Arial" w:hAnsi="Arial" w:cs="Arial"/>
+              </w:rPr>
+              <w:t>disponível</w:t>
             </w:r>
           </w:p>
           <w:p>
@@ -1490,7 +1606,7 @@
               <w:rPr>
                 <w:rFonts w:ascii="Arial" w:hAnsi="Arial" w:cs="Arial"/>
               </w:rPr>
-              <w:t>Baixa</w:t>
+              <w:t>Alta</w:t>
             </w:r>
           </w:p>
         </w:tc>
@@ -1505,7 +1621,6 @@
           </w:tcPr>
           <w:p>
             <w:pPr>
-              <w:jc w:val="both"/>
               <w:rPr>
                 <w:rFonts w:ascii="Arial" w:hAnsi="Arial" w:cs="Arial"/>
               </w:rPr>
@@ -1522,11 +1637,25 @@
               </w:rPr>
               <w:t>5</w:t>
             </w:r>
-            <w:r>
-              <w:rPr>
-                <w:rFonts w:ascii="Arial" w:hAnsi="Arial" w:cs="Arial"/>
-              </w:rPr>
-              <w:t>] Prover tela de exibição de materiais e livros digitais</w:t>
+            <w:proofErr w:type="gramStart"/>
+            <w:r>
+              <w:rPr>
+                <w:rFonts w:ascii="Arial" w:hAnsi="Arial" w:cs="Arial"/>
+              </w:rPr>
+              <w:t xml:space="preserve">] </w:t>
+            </w:r>
+            <w:r>
+              <w:rPr>
+                <w:rFonts w:ascii="Arial" w:hAnsi="Arial" w:cs="Arial"/>
+              </w:rPr>
+              <w:t>Buscar</w:t>
+            </w:r>
+            <w:proofErr w:type="gramEnd"/>
+            <w:r>
+              <w:rPr>
+                <w:rFonts w:ascii="Arial" w:hAnsi="Arial" w:cs="Arial"/>
+              </w:rPr>
+              <w:t xml:space="preserve"> modelos No Banco de dados</w:t>
             </w:r>
           </w:p>
         </w:tc>
@@ -1541,12 +1670,6 @@
                 <w:rFonts w:ascii="Arial" w:hAnsi="Arial" w:cs="Arial"/>
               </w:rPr>
             </w:pPr>
-            <w:r>
-              <w:rPr>
-                <w:rFonts w:ascii="Arial" w:hAnsi="Arial" w:cs="Arial"/>
-              </w:rPr>
-              <w:t>Tela exibirá livros, PDFs e textos digitais com opção de pesquisa e filtros por tema ou tipo. O usuário poderá visualizar o conteúdo na própria tela ou baixar o material.</w:t>
-            </w:r>
           </w:p>
         </w:tc>
         <w:tc>
@@ -1564,7 +1687,7 @@
               <w:rPr>
                 <w:rFonts w:ascii="Arial" w:hAnsi="Arial" w:cs="Arial"/>
               </w:rPr>
-              <w:t>Baixa</w:t>
+              <w:t>Alta</w:t>
             </w:r>
           </w:p>
         </w:tc>
@@ -1588,7 +1711,6 @@
               <w:rPr>
                 <w:rFonts w:ascii="Arial" w:hAnsi="Arial" w:cs="Arial"/>
               </w:rPr>
-              <w:lastRenderedPageBreak/>
               <w:t>[RF01</w:t>
             </w:r>
             <w:r>
@@ -1597,11 +1719,25 @@
               </w:rPr>
               <w:t>6</w:t>
             </w:r>
-            <w:r>
-              <w:rPr>
-                <w:rFonts w:ascii="Arial" w:hAnsi="Arial" w:cs="Arial"/>
-              </w:rPr>
-              <w:t>] Prover tela de visualização de livro selecionado</w:t>
+            <w:proofErr w:type="gramStart"/>
+            <w:r>
+              <w:rPr>
+                <w:rFonts w:ascii="Arial" w:hAnsi="Arial" w:cs="Arial"/>
+              </w:rPr>
+              <w:t>]</w:t>
+            </w:r>
+            <w:r>
+              <w:rPr>
+                <w:rFonts w:ascii="Arial" w:hAnsi="Arial" w:cs="Arial"/>
+              </w:rPr>
+              <w:t xml:space="preserve"> Prover</w:t>
+            </w:r>
+            <w:proofErr w:type="gramEnd"/>
+            <w:r>
+              <w:rPr>
+                <w:rFonts w:ascii="Arial" w:hAnsi="Arial" w:cs="Arial"/>
+              </w:rPr>
+              <w:t xml:space="preserve"> tela de exibição de Modelos de Redação</w:t>
             </w:r>
           </w:p>
         </w:tc>
@@ -1620,30 +1756,20 @@
               <w:rPr>
                 <w:rFonts w:ascii="Arial" w:hAnsi="Arial" w:cs="Arial"/>
               </w:rPr>
-              <w:t xml:space="preserve">Tela que exibirá o título, categoria, autor e texto completo do livro. Além da opção de </w:t>
-            </w:r>
-            <w:r>
-              <w:rPr>
-                <w:rFonts w:ascii="Arial" w:hAnsi="Arial" w:cs="Arial"/>
-              </w:rPr>
-              <w:t>voltar à tela anterior.</w:t>
-            </w:r>
-          </w:p>
-          <w:p>
-            <w:pPr>
-              <w:jc w:val="both"/>
-              <w:rPr>
-                <w:rFonts w:ascii="Arial" w:hAnsi="Arial" w:cs="Arial"/>
-              </w:rPr>
-            </w:pPr>
-          </w:p>
-          <w:p>
-            <w:pPr>
-              <w:jc w:val="both"/>
-              <w:rPr>
-                <w:rFonts w:ascii="Arial" w:hAnsi="Arial" w:cs="Arial"/>
-              </w:rPr>
-            </w:pPr>
+              <w:t>Tela que mostrará uma lista de modelos de redação, exibindo título e resumo de cada um. O usuário poderá clicar em cada modelo para visualizar o conteúdo completo. A tela terá botões para salvar modelos em favoritos</w:t>
+            </w:r>
+            <w:r>
+              <w:rPr>
+                <w:rFonts w:ascii="Arial" w:hAnsi="Arial" w:cs="Arial"/>
+              </w:rPr>
+              <w:t>, seleção de categorias</w:t>
+            </w:r>
+            <w:r>
+              <w:rPr>
+                <w:rFonts w:ascii="Arial" w:hAnsi="Arial" w:cs="Arial"/>
+              </w:rPr>
+              <w:t xml:space="preserve"> e voltar à tela anterior.</w:t>
+            </w:r>
           </w:p>
         </w:tc>
         <w:tc>
@@ -1661,7 +1787,7 @@
               <w:rPr>
                 <w:rFonts w:ascii="Arial" w:hAnsi="Arial" w:cs="Arial"/>
               </w:rPr>
-              <w:t>Baixa</w:t>
+              <w:t>Media</w:t>
             </w:r>
           </w:p>
         </w:tc>
@@ -1685,6 +1811,7 @@
               <w:rPr>
                 <w:rFonts w:ascii="Arial" w:hAnsi="Arial" w:cs="Arial"/>
               </w:rPr>
+              <w:lastRenderedPageBreak/>
               <w:t>[RF01</w:t>
             </w:r>
             <w:r>
@@ -1693,11 +1820,19 @@
               </w:rPr>
               <w:t>7</w:t>
             </w:r>
-            <w:r>
-              <w:rPr>
-                <w:rFonts w:ascii="Arial" w:hAnsi="Arial" w:cs="Arial"/>
-              </w:rPr>
-              <w:t>] Prover tela de chatbot de suporte para dúvidas sobre redação</w:t>
+            <w:proofErr w:type="gramStart"/>
+            <w:r>
+              <w:rPr>
+                <w:rFonts w:ascii="Arial" w:hAnsi="Arial" w:cs="Arial"/>
+              </w:rPr>
+              <w:t>] Prover</w:t>
+            </w:r>
+            <w:proofErr w:type="gramEnd"/>
+            <w:r>
+              <w:rPr>
+                <w:rFonts w:ascii="Arial" w:hAnsi="Arial" w:cs="Arial"/>
+              </w:rPr>
+              <w:t xml:space="preserve"> tela de visualização de modelo selecionado</w:t>
             </w:r>
           </w:p>
         </w:tc>
@@ -1716,7 +1851,13 @@
               <w:rPr>
                 <w:rFonts w:ascii="Arial" w:hAnsi="Arial" w:cs="Arial"/>
               </w:rPr>
-              <w:t>O chatbot permitirá que o usuário consulte informações sobre suas redações anteriores ou receba respostas prontas sobre temas comuns. A tela terá campo de digitação, botão para enviar mensagens e exibição das respostas.</w:t>
+              <w:t xml:space="preserve">Tela que exibirá o título, tema e texto completo do modelo de redação. Além da opção de </w:t>
+            </w:r>
+            <w:r>
+              <w:rPr>
+                <w:rFonts w:ascii="Arial" w:hAnsi="Arial" w:cs="Arial"/>
+              </w:rPr>
+              <w:t>voltar à tela anterior.</w:t>
             </w:r>
           </w:p>
           <w:p>
@@ -1743,7 +1884,7 @@
               <w:rPr>
                 <w:rFonts w:ascii="Arial" w:hAnsi="Arial" w:cs="Arial"/>
               </w:rPr>
-              <w:t>Media</w:t>
+              <w:t>Baixa</w:t>
             </w:r>
           </w:p>
         </w:tc>
@@ -1775,11 +1916,25 @@
               </w:rPr>
               <w:t>8</w:t>
             </w:r>
-            <w:r>
-              <w:rPr>
-                <w:rFonts w:ascii="Arial" w:hAnsi="Arial" w:cs="Arial"/>
-              </w:rPr>
-              <w:t>] Prover tela de configuração do sistema</w:t>
+            <w:proofErr w:type="gramStart"/>
+            <w:r>
+              <w:rPr>
+                <w:rFonts w:ascii="Arial" w:hAnsi="Arial" w:cs="Arial"/>
+              </w:rPr>
+              <w:t xml:space="preserve">] </w:t>
+            </w:r>
+            <w:r>
+              <w:rPr>
+                <w:rFonts w:ascii="Arial" w:hAnsi="Arial" w:cs="Arial"/>
+              </w:rPr>
+              <w:t>Buscar</w:t>
+            </w:r>
+            <w:proofErr w:type="gramEnd"/>
+            <w:r>
+              <w:rPr>
+                <w:rFonts w:ascii="Arial" w:hAnsi="Arial" w:cs="Arial"/>
+              </w:rPr>
+              <w:t xml:space="preserve"> livros no Banco de dados</w:t>
             </w:r>
           </w:p>
         </w:tc>
@@ -1787,20 +1942,6 @@
           <w:tcPr>
             <w:tcW w:w="4334" w:type="dxa"/>
           </w:tcPr>
-          <w:p>
-            <w:pPr>
-              <w:jc w:val="both"/>
-              <w:rPr>
-                <w:rFonts w:ascii="Arial" w:hAnsi="Arial" w:cs="Arial"/>
-              </w:rPr>
-            </w:pPr>
-            <w:r>
-              <w:rPr>
-                <w:rFonts w:ascii="Arial" w:hAnsi="Arial" w:cs="Arial"/>
-              </w:rPr>
-              <w:t>Tela permitirá alterar tema (claro/escuro), acessibilidade, notificação e dados pessoais. Botões de salvar alterações e voltar estarão disponíveis.</w:t>
-            </w:r>
-          </w:p>
           <w:p>
             <w:pPr>
               <w:jc w:val="both"/>
@@ -1840,7 +1981,6 @@
           </w:tcPr>
           <w:p>
             <w:pPr>
-              <w:jc w:val="both"/>
               <w:rPr>
                 <w:rFonts w:ascii="Arial" w:hAnsi="Arial" w:cs="Arial"/>
               </w:rPr>
@@ -1857,11 +1997,31 @@
               </w:rPr>
               <w:t>9</w:t>
             </w:r>
-            <w:r>
-              <w:rPr>
-                <w:rFonts w:ascii="Arial" w:hAnsi="Arial" w:cs="Arial"/>
-              </w:rPr>
-              <w:t>] Prover tela de politica de privacidade</w:t>
+            <w:proofErr w:type="gramStart"/>
+            <w:r>
+              <w:rPr>
+                <w:rFonts w:ascii="Arial" w:hAnsi="Arial" w:cs="Arial"/>
+              </w:rPr>
+              <w:t>] Prover</w:t>
+            </w:r>
+            <w:proofErr w:type="gramEnd"/>
+            <w:r>
+              <w:rPr>
+                <w:rFonts w:ascii="Arial" w:hAnsi="Arial" w:cs="Arial"/>
+              </w:rPr>
+              <w:t xml:space="preserve"> tela de exibição </w:t>
+            </w:r>
+            <w:r>
+              <w:rPr>
+                <w:rFonts w:ascii="Arial" w:hAnsi="Arial" w:cs="Arial"/>
+              </w:rPr>
+              <w:t xml:space="preserve">de </w:t>
+            </w:r>
+            <w:r>
+              <w:rPr>
+                <w:rFonts w:ascii="Arial" w:hAnsi="Arial" w:cs="Arial"/>
+              </w:rPr>
+              <w:t>livros digitais</w:t>
             </w:r>
           </w:p>
         </w:tc>
@@ -1880,16 +2040,22 @@
               <w:rPr>
                 <w:rFonts w:ascii="Arial" w:hAnsi="Arial" w:cs="Arial"/>
               </w:rPr>
-              <w:t>Tela exibirá toda a política sobre o manuseio dos dados do usuário no sistema e pela empresa</w:t>
-            </w:r>
-          </w:p>
-          <w:p>
-            <w:pPr>
-              <w:jc w:val="both"/>
-              <w:rPr>
-                <w:rFonts w:ascii="Arial" w:hAnsi="Arial" w:cs="Arial"/>
-              </w:rPr>
-            </w:pPr>
+              <w:t xml:space="preserve">Tela exibirá livros, </w:t>
+            </w:r>
+            <w:proofErr w:type="spellStart"/>
+            <w:r>
+              <w:rPr>
+                <w:rFonts w:ascii="Arial" w:hAnsi="Arial" w:cs="Arial"/>
+              </w:rPr>
+              <w:t>PDFs</w:t>
+            </w:r>
+            <w:proofErr w:type="spellEnd"/>
+            <w:r>
+              <w:rPr>
+                <w:rFonts w:ascii="Arial" w:hAnsi="Arial" w:cs="Arial"/>
+              </w:rPr>
+              <w:t xml:space="preserve"> e textos digitais com opção de pesquisa e filtros por tema ou tipo. O usuário poderá visualizar o conteúdo na própria tela ou baixar o material.</w:t>
+            </w:r>
           </w:p>
         </w:tc>
         <w:tc>
@@ -1907,7 +2073,7 @@
               <w:rPr>
                 <w:rFonts w:ascii="Arial" w:hAnsi="Arial" w:cs="Arial"/>
               </w:rPr>
-              <w:t>Alta</w:t>
+              <w:t>Baixa</w:t>
             </w:r>
           </w:p>
         </w:tc>
@@ -1931,7 +2097,27 @@
               <w:rPr>
                 <w:rFonts w:ascii="Arial" w:hAnsi="Arial" w:cs="Arial"/>
               </w:rPr>
-              <w:t>[RF020] Prover tela de Direito de uso</w:t>
+              <w:t>[RF0</w:t>
+            </w:r>
+            <w:r>
+              <w:rPr>
+                <w:rFonts w:ascii="Arial" w:hAnsi="Arial" w:cs="Arial"/>
+              </w:rPr>
+              <w:t>20</w:t>
+            </w:r>
+            <w:proofErr w:type="gramStart"/>
+            <w:r>
+              <w:rPr>
+                <w:rFonts w:ascii="Arial" w:hAnsi="Arial" w:cs="Arial"/>
+              </w:rPr>
+              <w:t>] Prover</w:t>
+            </w:r>
+            <w:proofErr w:type="gramEnd"/>
+            <w:r>
+              <w:rPr>
+                <w:rFonts w:ascii="Arial" w:hAnsi="Arial" w:cs="Arial"/>
+              </w:rPr>
+              <w:t xml:space="preserve"> tela de visualização de livro selecionado</w:t>
             </w:r>
           </w:p>
         </w:tc>
@@ -1950,20 +2136,22 @@
               <w:rPr>
                 <w:rFonts w:ascii="Arial" w:hAnsi="Arial" w:cs="Arial"/>
               </w:rPr>
-              <w:t xml:space="preserve">Tela exibirá toda a política sobre o </w:t>
-            </w:r>
-            <w:r>
-              <w:rPr>
-                <w:rFonts w:ascii="Arial" w:hAnsi="Arial" w:cs="Arial"/>
-              </w:rPr>
-              <w:t xml:space="preserve">Direito de uso </w:t>
-            </w:r>
-            <w:r>
-              <w:rPr>
-                <w:rFonts w:ascii="Arial" w:hAnsi="Arial" w:cs="Arial"/>
-              </w:rPr>
-              <w:t>do usuário</w:t>
-            </w:r>
+              <w:t xml:space="preserve">Tela que exibirá o título, categoria, autor e texto completo do livro. Além da opção de </w:t>
+            </w:r>
+            <w:r>
+              <w:rPr>
+                <w:rFonts w:ascii="Arial" w:hAnsi="Arial" w:cs="Arial"/>
+              </w:rPr>
+              <w:t>voltar à tela anterior.</w:t>
+            </w:r>
+          </w:p>
+          <w:p>
+            <w:pPr>
+              <w:jc w:val="both"/>
+              <w:rPr>
+                <w:rFonts w:ascii="Arial" w:hAnsi="Arial" w:cs="Arial"/>
+              </w:rPr>
+            </w:pPr>
           </w:p>
           <w:p>
             <w:pPr>
@@ -1989,7 +2177,7 @@
               <w:rPr>
                 <w:rFonts w:ascii="Arial" w:hAnsi="Arial" w:cs="Arial"/>
               </w:rPr>
-              <w:t>Alta</w:t>
+              <w:t>Baixa</w:t>
             </w:r>
           </w:p>
         </w:tc>
@@ -2013,7 +2201,41 @@
               <w:rPr>
                 <w:rFonts w:ascii="Arial" w:hAnsi="Arial" w:cs="Arial"/>
               </w:rPr>
-              <w:t>[RF021] Prover tela com opções de criação de redação</w:t>
+              <w:t>[RF0</w:t>
+            </w:r>
+            <w:r>
+              <w:rPr>
+                <w:rFonts w:ascii="Arial" w:hAnsi="Arial" w:cs="Arial"/>
+              </w:rPr>
+              <w:t>21</w:t>
+            </w:r>
+            <w:proofErr w:type="gramStart"/>
+            <w:r>
+              <w:rPr>
+                <w:rFonts w:ascii="Arial" w:hAnsi="Arial" w:cs="Arial"/>
+              </w:rPr>
+              <w:t>] Prover</w:t>
+            </w:r>
+            <w:proofErr w:type="gramEnd"/>
+            <w:r>
+              <w:rPr>
+                <w:rFonts w:ascii="Arial" w:hAnsi="Arial" w:cs="Arial"/>
+              </w:rPr>
+              <w:t xml:space="preserve"> tela de </w:t>
+            </w:r>
+            <w:proofErr w:type="spellStart"/>
+            <w:r>
+              <w:rPr>
+                <w:rFonts w:ascii="Arial" w:hAnsi="Arial" w:cs="Arial"/>
+              </w:rPr>
+              <w:t>chatbot</w:t>
+            </w:r>
+            <w:proofErr w:type="spellEnd"/>
+            <w:r>
+              <w:rPr>
+                <w:rFonts w:ascii="Arial" w:hAnsi="Arial" w:cs="Arial"/>
+              </w:rPr>
+              <w:t xml:space="preserve"> de suporte para dúvidas sobre redação</w:t>
             </w:r>
           </w:p>
         </w:tc>
@@ -2032,25 +2254,21 @@
               <w:rPr>
                 <w:rFonts w:ascii="Arial" w:hAnsi="Arial" w:cs="Arial"/>
               </w:rPr>
-              <w:t>Tela com os botões de nova redação</w:t>
-            </w:r>
-            <w:r>
-              <w:rPr>
-                <w:rFonts w:ascii="Arial" w:hAnsi="Arial" w:cs="Arial"/>
-              </w:rPr>
-              <w:t>: - digitar; foto; e arquivo; - e continuar redação: - continuar</w:t>
-            </w:r>
-            <w:r>
-              <w:rPr>
-                <w:rFonts w:ascii="Arial" w:hAnsi="Arial" w:cs="Arial"/>
-              </w:rPr>
-              <w:t xml:space="preserve"> redação</w:t>
-            </w:r>
-            <w:r>
-              <w:rPr>
-                <w:rFonts w:ascii="Arial" w:hAnsi="Arial" w:cs="Arial"/>
-              </w:rPr>
-              <w:t>-</w:t>
+              <w:t xml:space="preserve">O </w:t>
+            </w:r>
+            <w:proofErr w:type="spellStart"/>
+            <w:r>
+              <w:rPr>
+                <w:rFonts w:ascii="Arial" w:hAnsi="Arial" w:cs="Arial"/>
+              </w:rPr>
+              <w:t>chatbot</w:t>
+            </w:r>
+            <w:proofErr w:type="spellEnd"/>
+            <w:r>
+              <w:rPr>
+                <w:rFonts w:ascii="Arial" w:hAnsi="Arial" w:cs="Arial"/>
+              </w:rPr>
+              <w:t xml:space="preserve"> permitirá que o usuário consulte informações sobre suas redações anteriores ou receba respostas prontas sobre temas comuns. A tela terá campo de digitação, botão para enviar mensagens e exibição das respostas.</w:t>
             </w:r>
           </w:p>
           <w:p>
@@ -2077,7 +2295,7 @@
               <w:rPr>
                 <w:rFonts w:ascii="Arial" w:hAnsi="Arial" w:cs="Arial"/>
               </w:rPr>
-              <w:t>Alta</w:t>
+              <w:t>Media</w:t>
             </w:r>
           </w:p>
         </w:tc>
@@ -2101,8 +2319,48 @@
               <w:rPr>
                 <w:rFonts w:ascii="Arial" w:hAnsi="Arial" w:cs="Arial"/>
               </w:rPr>
-              <w:t xml:space="preserve">[RF022] Prover tela de seleção de tema para redação </w:t>
-            </w:r>
+              <w:t>[RF0</w:t>
+            </w:r>
+            <w:r>
+              <w:rPr>
+                <w:rFonts w:ascii="Arial" w:hAnsi="Arial" w:cs="Arial"/>
+              </w:rPr>
+              <w:t>22</w:t>
+            </w:r>
+            <w:proofErr w:type="gramStart"/>
+            <w:r>
+              <w:rPr>
+                <w:rFonts w:ascii="Arial" w:hAnsi="Arial" w:cs="Arial"/>
+              </w:rPr>
+              <w:t>]</w:t>
+            </w:r>
+            <w:r>
+              <w:rPr>
+                <w:rFonts w:ascii="Arial" w:hAnsi="Arial" w:cs="Arial"/>
+              </w:rPr>
+              <w:t xml:space="preserve"> </w:t>
+            </w:r>
+            <w:r>
+              <w:rPr>
+                <w:rFonts w:ascii="Arial" w:hAnsi="Arial" w:cs="Arial"/>
+              </w:rPr>
+              <w:t>Disponibilizar</w:t>
+            </w:r>
+            <w:proofErr w:type="gramEnd"/>
+            <w:r>
+              <w:rPr>
+                <w:rFonts w:ascii="Arial" w:hAnsi="Arial" w:cs="Arial"/>
+              </w:rPr>
+              <w:t xml:space="preserve"> envio do usuário pergunta para </w:t>
+            </w:r>
+            <w:proofErr w:type="spellStart"/>
+            <w:r>
+              <w:rPr>
+                <w:rFonts w:ascii="Arial" w:hAnsi="Arial" w:cs="Arial"/>
+              </w:rPr>
+              <w:t>chatbot</w:t>
+            </w:r>
+            <w:proofErr w:type="spellEnd"/>
           </w:p>
         </w:tc>
         <w:tc>
@@ -2116,20 +2374,6 @@
                 <w:rFonts w:ascii="Arial" w:hAnsi="Arial" w:cs="Arial"/>
               </w:rPr>
             </w:pPr>
-            <w:r>
-              <w:rPr>
-                <w:rFonts w:ascii="Arial" w:hAnsi="Arial" w:cs="Arial"/>
-              </w:rPr>
-              <w:t>A tela exibirá uma lista de temas do ENEM e outros vestibulares semelhantes com opção de seleção via botão ou lista suspensa. Ao selecionar um tema, os textos norteadores. Correspondentes serão exibidos abaixo da seleção.</w:t>
-            </w:r>
-          </w:p>
-          <w:p>
-            <w:pPr>
-              <w:jc w:val="both"/>
-              <w:rPr>
-                <w:rFonts w:ascii="Arial" w:hAnsi="Arial" w:cs="Arial"/>
-              </w:rPr>
-            </w:pPr>
           </w:p>
         </w:tc>
         <w:tc>
@@ -2143,12 +2387,6 @@
                 <w:rFonts w:ascii="Arial" w:hAnsi="Arial" w:cs="Arial"/>
               </w:rPr>
             </w:pPr>
-            <w:r>
-              <w:rPr>
-                <w:rFonts w:ascii="Arial" w:hAnsi="Arial" w:cs="Arial"/>
-              </w:rPr>
-              <w:t>Alta</w:t>
-            </w:r>
           </w:p>
         </w:tc>
       </w:tr>
@@ -2171,8 +2409,42 @@
               <w:rPr>
                 <w:rFonts w:ascii="Arial" w:hAnsi="Arial" w:cs="Arial"/>
               </w:rPr>
-              <w:t>[RF023] Prover tela de exibição de texto norteador do tema escolhido</w:t>
-            </w:r>
+              <w:t>[RF0</w:t>
+            </w:r>
+            <w:r>
+              <w:rPr>
+                <w:rFonts w:ascii="Arial" w:hAnsi="Arial" w:cs="Arial"/>
+              </w:rPr>
+              <w:t>23</w:t>
+            </w:r>
+            <w:proofErr w:type="gramStart"/>
+            <w:r>
+              <w:rPr>
+                <w:rFonts w:ascii="Arial" w:hAnsi="Arial" w:cs="Arial"/>
+              </w:rPr>
+              <w:t>]</w:t>
+            </w:r>
+            <w:r>
+              <w:rPr>
+                <w:rFonts w:ascii="Arial" w:hAnsi="Arial" w:cs="Arial"/>
+              </w:rPr>
+              <w:t xml:space="preserve"> Disponibilizar</w:t>
+            </w:r>
+            <w:proofErr w:type="gramEnd"/>
+            <w:r>
+              <w:rPr>
+                <w:rFonts w:ascii="Arial" w:hAnsi="Arial" w:cs="Arial"/>
+              </w:rPr>
+              <w:t xml:space="preserve"> geração de resposta e pergunta pelo </w:t>
+            </w:r>
+            <w:proofErr w:type="spellStart"/>
+            <w:r>
+              <w:rPr>
+                <w:rFonts w:ascii="Arial" w:hAnsi="Arial" w:cs="Arial"/>
+              </w:rPr>
+              <w:t>Chatbot</w:t>
+            </w:r>
+            <w:proofErr w:type="spellEnd"/>
           </w:p>
         </w:tc>
         <w:tc>
@@ -2186,20 +2458,6 @@
                 <w:rFonts w:ascii="Arial" w:hAnsi="Arial" w:cs="Arial"/>
               </w:rPr>
             </w:pPr>
-            <w:r>
-              <w:rPr>
-                <w:rFonts w:ascii="Arial" w:hAnsi="Arial" w:cs="Arial"/>
-              </w:rPr>
-              <w:t>Após o usuário escolher um tema, a tela mostrará textos explicativos ou norteadores relacionados, que poderão ser rolados ou expandidos. Cada texto terá título e conteúdo resumido</w:t>
-            </w:r>
-          </w:p>
-          <w:p>
-            <w:pPr>
-              <w:jc w:val="both"/>
-              <w:rPr>
-                <w:rFonts w:ascii="Arial" w:hAnsi="Arial" w:cs="Arial"/>
-              </w:rPr>
-            </w:pPr>
           </w:p>
         </w:tc>
         <w:tc>
@@ -2213,12 +2471,6 @@
                 <w:rFonts w:ascii="Arial" w:hAnsi="Arial" w:cs="Arial"/>
               </w:rPr>
             </w:pPr>
-            <w:r>
-              <w:rPr>
-                <w:rFonts w:ascii="Arial" w:hAnsi="Arial" w:cs="Arial"/>
-              </w:rPr>
-              <w:t>Baixa</w:t>
-            </w:r>
           </w:p>
         </w:tc>
       </w:tr>
@@ -2241,7 +2493,53 @@
               <w:rPr>
                 <w:rFonts w:ascii="Arial" w:hAnsi="Arial" w:cs="Arial"/>
               </w:rPr>
-              <w:t>[RF024] Prover tela de ambiente para produção de redação digitada</w:t>
+              <w:t>[RF0</w:t>
+            </w:r>
+            <w:r>
+              <w:rPr>
+                <w:rFonts w:ascii="Arial" w:hAnsi="Arial" w:cs="Arial"/>
+              </w:rPr>
+              <w:t>24</w:t>
+            </w:r>
+            <w:proofErr w:type="gramStart"/>
+            <w:r>
+              <w:rPr>
+                <w:rFonts w:ascii="Arial" w:hAnsi="Arial" w:cs="Arial"/>
+              </w:rPr>
+              <w:t>]</w:t>
+            </w:r>
+            <w:r>
+              <w:rPr>
+                <w:rFonts w:ascii="Arial" w:hAnsi="Arial" w:cs="Arial"/>
+              </w:rPr>
+              <w:t xml:space="preserve"> </w:t>
+            </w:r>
+            <w:r>
+              <w:rPr>
+                <w:rFonts w:ascii="Arial" w:hAnsi="Arial" w:cs="Arial"/>
+              </w:rPr>
+              <w:t>Disponibilizar</w:t>
+            </w:r>
+            <w:proofErr w:type="gramEnd"/>
+            <w:r>
+              <w:rPr>
+                <w:rFonts w:ascii="Arial" w:hAnsi="Arial" w:cs="Arial"/>
+              </w:rPr>
+              <w:t xml:space="preserve"> resposta gerada pelo </w:t>
+            </w:r>
+            <w:proofErr w:type="spellStart"/>
+            <w:r>
+              <w:rPr>
+                <w:rFonts w:ascii="Arial" w:hAnsi="Arial" w:cs="Arial"/>
+              </w:rPr>
+              <w:t>chatbot</w:t>
+            </w:r>
+            <w:proofErr w:type="spellEnd"/>
+            <w:r>
+              <w:rPr>
+                <w:rFonts w:ascii="Arial" w:hAnsi="Arial" w:cs="Arial"/>
+              </w:rPr>
+              <w:t xml:space="preserve"> ao usuário</w:t>
             </w:r>
           </w:p>
         </w:tc>
@@ -2256,92 +2554,6 @@
                 <w:rFonts w:ascii="Arial" w:hAnsi="Arial" w:cs="Arial"/>
               </w:rPr>
             </w:pPr>
-            <w:r>
-              <w:rPr>
-                <w:rFonts w:ascii="Arial" w:hAnsi="Arial" w:cs="Arial"/>
-              </w:rPr>
-              <w:t xml:space="preserve">Tela com </w:t>
-            </w:r>
-            <w:r>
-              <w:rPr>
-                <w:rFonts w:ascii="Arial" w:hAnsi="Arial" w:cs="Arial"/>
-              </w:rPr>
-              <w:t>campos para digitar título e texto de redação com</w:t>
-            </w:r>
-            <w:r>
-              <w:rPr>
-                <w:rFonts w:ascii="Arial" w:hAnsi="Arial" w:cs="Arial"/>
-              </w:rPr>
-              <w:t xml:space="preserve"> contagem de caracteres</w:t>
-            </w:r>
-            <w:r>
-              <w:rPr>
-                <w:rFonts w:ascii="Arial" w:hAnsi="Arial" w:cs="Arial"/>
-              </w:rPr>
-              <w:t xml:space="preserve">. Além de </w:t>
-            </w:r>
-            <w:r>
-              <w:rPr>
-                <w:rFonts w:ascii="Arial" w:hAnsi="Arial" w:cs="Arial"/>
-              </w:rPr>
-              <w:t>botões</w:t>
-            </w:r>
-            <w:r>
-              <w:rPr>
-                <w:rFonts w:ascii="Arial" w:hAnsi="Arial" w:cs="Arial"/>
-              </w:rPr>
-              <w:t>: “</w:t>
-            </w:r>
-            <w:r>
-              <w:rPr>
-                <w:rFonts w:ascii="Arial" w:hAnsi="Arial" w:cs="Arial"/>
-              </w:rPr>
-              <w:t>Salvar</w:t>
-            </w:r>
-            <w:r>
-              <w:rPr>
-                <w:rFonts w:ascii="Arial" w:hAnsi="Arial" w:cs="Arial"/>
-              </w:rPr>
-              <w:t>”</w:t>
-            </w:r>
-            <w:r>
-              <w:rPr>
-                <w:rFonts w:ascii="Arial" w:hAnsi="Arial" w:cs="Arial"/>
-              </w:rPr>
-              <w:t xml:space="preserve">, </w:t>
-            </w:r>
-            <w:r>
-              <w:rPr>
-                <w:rFonts w:ascii="Arial" w:hAnsi="Arial" w:cs="Arial"/>
-              </w:rPr>
-              <w:t>“</w:t>
-            </w:r>
-            <w:r>
-              <w:rPr>
-                <w:rFonts w:ascii="Arial" w:hAnsi="Arial" w:cs="Arial"/>
-              </w:rPr>
-              <w:t>Enviar</w:t>
-            </w:r>
-            <w:r>
-              <w:rPr>
-                <w:rFonts w:ascii="Arial" w:hAnsi="Arial" w:cs="Arial"/>
-              </w:rPr>
-              <w:t>” e “Voltar”</w:t>
-            </w:r>
-            <w:r>
-              <w:rPr>
-                <w:rFonts w:ascii="Arial" w:hAnsi="Arial" w:cs="Arial"/>
-              </w:rPr>
-              <w:t>.</w:t>
-            </w:r>
-          </w:p>
-          <w:p>
-            <w:pPr>
-              <w:jc w:val="both"/>
-              <w:rPr>
-                <w:rFonts w:ascii="Arial" w:hAnsi="Arial" w:cs="Arial"/>
-              </w:rPr>
-            </w:pPr>
           </w:p>
         </w:tc>
         <w:tc>
@@ -2355,12 +2567,6 @@
                 <w:rFonts w:ascii="Arial" w:hAnsi="Arial" w:cs="Arial"/>
               </w:rPr>
             </w:pPr>
-            <w:r>
-              <w:rPr>
-                <w:rFonts w:ascii="Arial" w:hAnsi="Arial" w:cs="Arial"/>
-              </w:rPr>
-              <w:t>Alta</w:t>
-            </w:r>
           </w:p>
         </w:tc>
       </w:tr>
@@ -2383,7 +2589,27 @@
               <w:rPr>
                 <w:rFonts w:ascii="Arial" w:hAnsi="Arial" w:cs="Arial"/>
               </w:rPr>
-              <w:t>[RF025] Prover tela de seleção de arquivo com redação</w:t>
+              <w:t>[RF0</w:t>
+            </w:r>
+            <w:r>
+              <w:rPr>
+                <w:rFonts w:ascii="Arial" w:hAnsi="Arial" w:cs="Arial"/>
+              </w:rPr>
+              <w:t>25</w:t>
+            </w:r>
+            <w:proofErr w:type="gramStart"/>
+            <w:r>
+              <w:rPr>
+                <w:rFonts w:ascii="Arial" w:hAnsi="Arial" w:cs="Arial"/>
+              </w:rPr>
+              <w:t>] Prover</w:t>
+            </w:r>
+            <w:proofErr w:type="gramEnd"/>
+            <w:r>
+              <w:rPr>
+                <w:rFonts w:ascii="Arial" w:hAnsi="Arial" w:cs="Arial"/>
+              </w:rPr>
+              <w:t xml:space="preserve"> tela de configuração do sistema</w:t>
             </w:r>
           </w:p>
         </w:tc>
@@ -2402,79 +2628,7 @@
               <w:rPr>
                 <w:rFonts w:ascii="Arial" w:hAnsi="Arial" w:cs="Arial"/>
               </w:rPr>
-              <w:t xml:space="preserve">Tela com </w:t>
-            </w:r>
-            <w:r>
-              <w:rPr>
-                <w:rFonts w:ascii="Arial" w:hAnsi="Arial" w:cs="Arial"/>
-              </w:rPr>
-              <w:t>campo para digitar título</w:t>
-            </w:r>
-            <w:r>
-              <w:rPr>
-                <w:rFonts w:ascii="Arial" w:hAnsi="Arial" w:cs="Arial"/>
-              </w:rPr>
-              <w:t xml:space="preserve"> e botão de seleção de arquivo de redação local</w:t>
-            </w:r>
-            <w:r>
-              <w:rPr>
-                <w:rFonts w:ascii="Arial" w:hAnsi="Arial" w:cs="Arial"/>
-              </w:rPr>
-              <w:t xml:space="preserve">. Além de </w:t>
-            </w:r>
-            <w:r>
-              <w:rPr>
-                <w:rFonts w:ascii="Arial" w:hAnsi="Arial" w:cs="Arial"/>
-              </w:rPr>
-              <w:t>botões</w:t>
-            </w:r>
-            <w:r>
-              <w:rPr>
-                <w:rFonts w:ascii="Arial" w:hAnsi="Arial" w:cs="Arial"/>
-              </w:rPr>
-              <w:t>: “</w:t>
-            </w:r>
-            <w:r>
-              <w:rPr>
-                <w:rFonts w:ascii="Arial" w:hAnsi="Arial" w:cs="Arial"/>
-              </w:rPr>
-              <w:t>Salvar</w:t>
-            </w:r>
-            <w:r>
-              <w:rPr>
-                <w:rFonts w:ascii="Arial" w:hAnsi="Arial" w:cs="Arial"/>
-              </w:rPr>
-              <w:t>”</w:t>
-            </w:r>
-            <w:r>
-              <w:rPr>
-                <w:rFonts w:ascii="Arial" w:hAnsi="Arial" w:cs="Arial"/>
-              </w:rPr>
-              <w:t xml:space="preserve">, </w:t>
-            </w:r>
-            <w:r>
-              <w:rPr>
-                <w:rFonts w:ascii="Arial" w:hAnsi="Arial" w:cs="Arial"/>
-              </w:rPr>
-              <w:t>“</w:t>
-            </w:r>
-            <w:r>
-              <w:rPr>
-                <w:rFonts w:ascii="Arial" w:hAnsi="Arial" w:cs="Arial"/>
-              </w:rPr>
-              <w:t>Enviar</w:t>
-            </w:r>
-            <w:r>
-              <w:rPr>
-                <w:rFonts w:ascii="Arial" w:hAnsi="Arial" w:cs="Arial"/>
-              </w:rPr>
-              <w:t>” e “Voltar”</w:t>
-            </w:r>
-            <w:r>
-              <w:rPr>
-                <w:rFonts w:ascii="Arial" w:hAnsi="Arial" w:cs="Arial"/>
-              </w:rPr>
-              <w:t>.</w:t>
+              <w:t>Tela permitirá alterar tema (claro/escuro), acessibilidade, notificação e dados pessoais. Botões de salvar alterações e voltar estarão disponíveis.</w:t>
             </w:r>
           </w:p>
           <w:p>
@@ -2501,7 +2655,7 @@
               <w:rPr>
                 <w:rFonts w:ascii="Arial" w:hAnsi="Arial" w:cs="Arial"/>
               </w:rPr>
-              <w:t>Média</w:t>
+              <w:t>Alta</w:t>
             </w:r>
           </w:p>
         </w:tc>
@@ -2525,8 +2679,33 @@
               <w:rPr>
                 <w:rFonts w:ascii="Arial" w:hAnsi="Arial" w:cs="Arial"/>
               </w:rPr>
-              <w:lastRenderedPageBreak/>
-              <w:t>[RF026] Prover tela de seleção de redação salva</w:t>
+              <w:t>[RF0</w:t>
+            </w:r>
+            <w:r>
+              <w:rPr>
+                <w:rFonts w:ascii="Arial" w:hAnsi="Arial" w:cs="Arial"/>
+              </w:rPr>
+              <w:t>26</w:t>
+            </w:r>
+            <w:proofErr w:type="gramStart"/>
+            <w:r>
+              <w:rPr>
+                <w:rFonts w:ascii="Arial" w:hAnsi="Arial" w:cs="Arial"/>
+              </w:rPr>
+              <w:t xml:space="preserve">] </w:t>
+            </w:r>
+            <w:r>
+              <w:rPr>
+                <w:rFonts w:ascii="Arial" w:hAnsi="Arial" w:cs="Arial"/>
+              </w:rPr>
+              <w:t>Salvar</w:t>
+            </w:r>
+            <w:proofErr w:type="gramEnd"/>
+            <w:r>
+              <w:rPr>
+                <w:rFonts w:ascii="Arial" w:hAnsi="Arial" w:cs="Arial"/>
+              </w:rPr>
+              <w:t xml:space="preserve"> configurações o usuário no banco de dados</w:t>
             </w:r>
           </w:p>
         </w:tc>
@@ -2539,21 +2718,6 @@
               <w:jc w:val="both"/>
               <w:rPr>
                 <w:rFonts w:ascii="Arial" w:hAnsi="Arial" w:cs="Arial"/>
-                <w:u w:val="single"/>
-              </w:rPr>
-            </w:pPr>
-            <w:r>
-              <w:rPr>
-                <w:rFonts w:ascii="Arial" w:hAnsi="Arial" w:cs="Arial"/>
-              </w:rPr>
-              <w:t>Tela exibirá todas as redações já salvas pelo usuário</w:t>
-            </w:r>
-          </w:p>
-          <w:p>
-            <w:pPr>
-              <w:jc w:val="both"/>
-              <w:rPr>
-                <w:rFonts w:ascii="Arial" w:hAnsi="Arial" w:cs="Arial"/>
               </w:rPr>
             </w:pPr>
           </w:p>
@@ -2573,7 +2737,7 @@
               <w:rPr>
                 <w:rFonts w:ascii="Arial" w:hAnsi="Arial" w:cs="Arial"/>
               </w:rPr>
-              <w:t>Média</w:t>
+              <w:t>Media</w:t>
             </w:r>
           </w:p>
         </w:tc>
@@ -2597,7 +2761,41 @@
               <w:rPr>
                 <w:rFonts w:ascii="Arial" w:hAnsi="Arial" w:cs="Arial"/>
               </w:rPr>
-              <w:t>[RF027] Prover tela para a realização da correção automática por IA</w:t>
+              <w:t>[RF0</w:t>
+            </w:r>
+            <w:r>
+              <w:rPr>
+                <w:rFonts w:ascii="Arial" w:hAnsi="Arial" w:cs="Arial"/>
+              </w:rPr>
+              <w:t>27</w:t>
+            </w:r>
+            <w:proofErr w:type="gramStart"/>
+            <w:r>
+              <w:rPr>
+                <w:rFonts w:ascii="Arial" w:hAnsi="Arial" w:cs="Arial"/>
+              </w:rPr>
+              <w:t>] Prover</w:t>
+            </w:r>
+            <w:proofErr w:type="gramEnd"/>
+            <w:r>
+              <w:rPr>
+                <w:rFonts w:ascii="Arial" w:hAnsi="Arial" w:cs="Arial"/>
+              </w:rPr>
+              <w:t xml:space="preserve"> tela de </w:t>
+            </w:r>
+            <w:proofErr w:type="spellStart"/>
+            <w:r>
+              <w:rPr>
+                <w:rFonts w:ascii="Arial" w:hAnsi="Arial" w:cs="Arial"/>
+              </w:rPr>
+              <w:t>politica</w:t>
+            </w:r>
+            <w:proofErr w:type="spellEnd"/>
+            <w:r>
+              <w:rPr>
+                <w:rFonts w:ascii="Arial" w:hAnsi="Arial" w:cs="Arial"/>
+              </w:rPr>
+              <w:t xml:space="preserve"> de privacidade</w:t>
             </w:r>
           </w:p>
         </w:tc>
@@ -2616,7 +2814,7 @@
               <w:rPr>
                 <w:rFonts w:ascii="Arial" w:hAnsi="Arial" w:cs="Arial"/>
               </w:rPr>
-              <w:t>Após envio da redação, a IA fará a correção considerando semântica, sintaxe, gramática e ortografia. O usuário verá os pontos avaliados e possíveis erros destacados, seguindo as competências avaliadas pelo Inep.</w:t>
+              <w:t>Tela exibirá toda a política sobre o manuseio dos dados do usuário no sistema e pela empresa</w:t>
             </w:r>
           </w:p>
           <w:p>
@@ -2667,7 +2865,27 @@
               <w:rPr>
                 <w:rFonts w:ascii="Arial" w:hAnsi="Arial" w:cs="Arial"/>
               </w:rPr>
-              <w:t>[RF028] Prover tela de histórico das redações</w:t>
+              <w:t>[RF0</w:t>
+            </w:r>
+            <w:r>
+              <w:rPr>
+                <w:rFonts w:ascii="Arial" w:hAnsi="Arial" w:cs="Arial"/>
+              </w:rPr>
+              <w:t>28</w:t>
+            </w:r>
+            <w:proofErr w:type="gramStart"/>
+            <w:r>
+              <w:rPr>
+                <w:rFonts w:ascii="Arial" w:hAnsi="Arial" w:cs="Arial"/>
+              </w:rPr>
+              <w:t>] Prover</w:t>
+            </w:r>
+            <w:proofErr w:type="gramEnd"/>
+            <w:r>
+              <w:rPr>
+                <w:rFonts w:ascii="Arial" w:hAnsi="Arial" w:cs="Arial"/>
+              </w:rPr>
+              <w:t xml:space="preserve"> tela de Direito de uso</w:t>
             </w:r>
           </w:p>
         </w:tc>
@@ -2686,7 +2904,7 @@
               <w:rPr>
                 <w:rFonts w:ascii="Arial" w:hAnsi="Arial" w:cs="Arial"/>
               </w:rPr>
-              <w:t>Tela exibirá todas as redações enviadas pelo usuário com data, tema, nota e link para visualização do texto e feedback.</w:t>
+              <w:t>Tela exibirá toda a política sobre o Direito de uso do usuário</w:t>
             </w:r>
           </w:p>
           <w:p>
@@ -2737,7 +2955,27 @@
               <w:rPr>
                 <w:rFonts w:ascii="Arial" w:hAnsi="Arial" w:cs="Arial"/>
               </w:rPr>
-              <w:t>[RF029] Prover tela de descrição detalhada sobre a redação corrigida</w:t>
+              <w:t>[RF02</w:t>
+            </w:r>
+            <w:r>
+              <w:rPr>
+                <w:rFonts w:ascii="Arial" w:hAnsi="Arial" w:cs="Arial"/>
+              </w:rPr>
+              <w:t>9</w:t>
+            </w:r>
+            <w:proofErr w:type="gramStart"/>
+            <w:r>
+              <w:rPr>
+                <w:rFonts w:ascii="Arial" w:hAnsi="Arial" w:cs="Arial"/>
+              </w:rPr>
+              <w:t>] Prover</w:t>
+            </w:r>
+            <w:proofErr w:type="gramEnd"/>
+            <w:r>
+              <w:rPr>
+                <w:rFonts w:ascii="Arial" w:hAnsi="Arial" w:cs="Arial"/>
+              </w:rPr>
+              <w:t xml:space="preserve"> tela com opções de criação de redação</w:t>
             </w:r>
           </w:p>
         </w:tc>
@@ -2756,7 +2994,25 @@
               <w:rPr>
                 <w:rFonts w:ascii="Arial" w:hAnsi="Arial" w:cs="Arial"/>
               </w:rPr>
-              <w:t xml:space="preserve">Tela que exibirá a pontuação sobre cada competência  com a nota média final, feedback sobre cada competência, comentários, erros detalhados e sugestões de melhoria, Além de um botão para ler a redação. Redações que não foram corrigidas terão apenas o botão de abrir redação permitindo alteração </w:t>
+              <w:t>Tela com os botões de nova redação</w:t>
+            </w:r>
+            <w:r>
+              <w:rPr>
+                <w:rFonts w:ascii="Arial" w:hAnsi="Arial" w:cs="Arial"/>
+              </w:rPr>
+              <w:t>: - digitar; foto; e arquivo; - e continuar redação: - continuar</w:t>
+            </w:r>
+            <w:r>
+              <w:rPr>
+                <w:rFonts w:ascii="Arial" w:hAnsi="Arial" w:cs="Arial"/>
+              </w:rPr>
+              <w:t xml:space="preserve"> redação</w:t>
+            </w:r>
+            <w:r>
+              <w:rPr>
+                <w:rFonts w:ascii="Arial" w:hAnsi="Arial" w:cs="Arial"/>
+              </w:rPr>
+              <w:t>-</w:t>
             </w:r>
           </w:p>
           <w:p>
@@ -2783,6 +3039,7 @@
               <w:rPr>
                 <w:rFonts w:ascii="Arial" w:hAnsi="Arial" w:cs="Arial"/>
               </w:rPr>
+              <w:lastRenderedPageBreak/>
               <w:t>Alta</w:t>
             </w:r>
           </w:p>
@@ -2807,7 +3064,45 @@
               <w:rPr>
                 <w:rFonts w:ascii="Arial" w:hAnsi="Arial" w:cs="Arial"/>
               </w:rPr>
-              <w:t>[RF030] Prover tela com explicação da pontuação</w:t>
+              <w:t>[RF0</w:t>
+            </w:r>
+            <w:r>
+              <w:rPr>
+                <w:rFonts w:ascii="Arial" w:hAnsi="Arial" w:cs="Arial"/>
+              </w:rPr>
+              <w:t>3</w:t>
+            </w:r>
+            <w:r>
+              <w:rPr>
+                <w:rFonts w:ascii="Arial" w:hAnsi="Arial" w:cs="Arial"/>
+              </w:rPr>
+              <w:t>0</w:t>
+            </w:r>
+            <w:proofErr w:type="gramStart"/>
+            <w:r>
+              <w:rPr>
+                <w:rFonts w:ascii="Arial" w:hAnsi="Arial" w:cs="Arial"/>
+              </w:rPr>
+              <w:t>]</w:t>
+            </w:r>
+            <w:r>
+              <w:rPr>
+                <w:rFonts w:ascii="Arial" w:hAnsi="Arial" w:cs="Arial"/>
+              </w:rPr>
+              <w:t xml:space="preserve"> S</w:t>
+            </w:r>
+            <w:r>
+              <w:rPr>
+                <w:rFonts w:ascii="Arial" w:hAnsi="Arial" w:cs="Arial"/>
+              </w:rPr>
+              <w:t>alvar</w:t>
+            </w:r>
+            <w:proofErr w:type="gramEnd"/>
+            <w:r>
+              <w:rPr>
+                <w:rFonts w:ascii="Arial" w:hAnsi="Arial" w:cs="Arial"/>
+              </w:rPr>
+              <w:t xml:space="preserve"> opção de redação selecionada</w:t>
             </w:r>
           </w:p>
         </w:tc>
@@ -2823,14 +3118,6 @@
               </w:rPr>
             </w:pPr>
           </w:p>
-          <w:p>
-            <w:pPr>
-              <w:jc w:val="both"/>
-              <w:rPr>
-                <w:rFonts w:ascii="Arial" w:hAnsi="Arial" w:cs="Arial"/>
-              </w:rPr>
-            </w:pPr>
-          </w:p>
         </w:tc>
         <w:tc>
           <w:tcPr>
@@ -2843,12 +3130,6 @@
                 <w:rFonts w:ascii="Arial" w:hAnsi="Arial" w:cs="Arial"/>
               </w:rPr>
             </w:pPr>
-            <w:r>
-              <w:rPr>
-                <w:rFonts w:ascii="Arial" w:hAnsi="Arial" w:cs="Arial"/>
-              </w:rPr>
-              <w:t>Baixa</w:t>
-            </w:r>
           </w:p>
         </w:tc>
       </w:tr>
@@ -2871,7 +3152,39 @@
               <w:rPr>
                 <w:rFonts w:ascii="Arial" w:hAnsi="Arial" w:cs="Arial"/>
               </w:rPr>
-              <w:t>[RF031] Prover tela de desempenho do usuário</w:t>
+              <w:t>[RF0</w:t>
+            </w:r>
+            <w:r>
+              <w:rPr>
+                <w:rFonts w:ascii="Arial" w:hAnsi="Arial" w:cs="Arial"/>
+              </w:rPr>
+              <w:t>3</w:t>
+            </w:r>
+            <w:r>
+              <w:rPr>
+                <w:rFonts w:ascii="Arial" w:hAnsi="Arial" w:cs="Arial"/>
+              </w:rPr>
+              <w:t>1</w:t>
+            </w:r>
+            <w:proofErr w:type="gramStart"/>
+            <w:r>
+              <w:rPr>
+                <w:rFonts w:ascii="Arial" w:hAnsi="Arial" w:cs="Arial"/>
+              </w:rPr>
+              <w:t xml:space="preserve">] </w:t>
+            </w:r>
+            <w:r>
+              <w:rPr>
+                <w:rFonts w:ascii="Arial" w:hAnsi="Arial" w:cs="Arial"/>
+              </w:rPr>
+              <w:t>Buscar</w:t>
+            </w:r>
+            <w:proofErr w:type="gramEnd"/>
+            <w:r>
+              <w:rPr>
+                <w:rFonts w:ascii="Arial" w:hAnsi="Arial" w:cs="Arial"/>
+              </w:rPr>
+              <w:t xml:space="preserve"> temas de redações no banco de dados</w:t>
             </w:r>
           </w:p>
         </w:tc>
@@ -2886,20 +3199,6 @@
                 <w:rFonts w:ascii="Arial" w:hAnsi="Arial" w:cs="Arial"/>
               </w:rPr>
             </w:pPr>
-            <w:r>
-              <w:rPr>
-                <w:rFonts w:ascii="Arial" w:hAnsi="Arial" w:cs="Arial"/>
-              </w:rPr>
-              <w:t>Tela mostrará gráficos de evolução das redações, incluindo pontuações e erros recorrentes.</w:t>
-            </w:r>
-          </w:p>
-          <w:p>
-            <w:pPr>
-              <w:jc w:val="both"/>
-              <w:rPr>
-                <w:rFonts w:ascii="Arial" w:hAnsi="Arial" w:cs="Arial"/>
-              </w:rPr>
-            </w:pPr>
           </w:p>
         </w:tc>
         <w:tc>
@@ -2913,12 +3212,6 @@
                 <w:rFonts w:ascii="Arial" w:hAnsi="Arial" w:cs="Arial"/>
               </w:rPr>
             </w:pPr>
-            <w:r>
-              <w:rPr>
-                <w:rFonts w:ascii="Arial" w:hAnsi="Arial" w:cs="Arial"/>
-              </w:rPr>
-              <w:t>Media</w:t>
-            </w:r>
           </w:p>
         </w:tc>
       </w:tr>
@@ -2941,7 +3234,33 @@
               <w:rPr>
                 <w:rFonts w:ascii="Arial" w:hAnsi="Arial" w:cs="Arial"/>
               </w:rPr>
-              <w:t>[RF032] Prover exibição de menu principal no aplicativo</w:t>
+              <w:t>[RF0</w:t>
+            </w:r>
+            <w:r>
+              <w:rPr>
+                <w:rFonts w:ascii="Arial" w:hAnsi="Arial" w:cs="Arial"/>
+              </w:rPr>
+              <w:t>3</w:t>
+            </w:r>
+            <w:r>
+              <w:rPr>
+                <w:rFonts w:ascii="Arial" w:hAnsi="Arial" w:cs="Arial"/>
+              </w:rPr>
+              <w:t>2</w:t>
+            </w:r>
+            <w:proofErr w:type="gramStart"/>
+            <w:r>
+              <w:rPr>
+                <w:rFonts w:ascii="Arial" w:hAnsi="Arial" w:cs="Arial"/>
+              </w:rPr>
+              <w:t>] Prover</w:t>
+            </w:r>
+            <w:proofErr w:type="gramEnd"/>
+            <w:r>
+              <w:rPr>
+                <w:rFonts w:ascii="Arial" w:hAnsi="Arial" w:cs="Arial"/>
+              </w:rPr>
+              <w:t xml:space="preserve"> tela de seleção de tema para redação </w:t>
             </w:r>
           </w:p>
         </w:tc>
@@ -2956,6 +3275,12 @@
                 <w:rFonts w:ascii="Arial" w:hAnsi="Arial" w:cs="Arial"/>
               </w:rPr>
             </w:pPr>
+            <w:r>
+              <w:rPr>
+                <w:rFonts w:ascii="Arial" w:hAnsi="Arial" w:cs="Arial"/>
+              </w:rPr>
+              <w:t>A tela exibirá uma lista de temas do ENEM e outros vestibulares semelhantes com opção de seleção via botão ou lista suspensa. Ao selecionar um tema, os textos norteadores. Correspondentes serão exibidos abaixo da seleção.</w:t>
+            </w:r>
           </w:p>
           <w:p>
             <w:pPr>
@@ -3005,7 +3330,45 @@
               <w:rPr>
                 <w:rFonts w:ascii="Arial" w:hAnsi="Arial" w:cs="Arial"/>
               </w:rPr>
-              <w:t>[RF033] Prover exibição de menu secundário no aplicativo</w:t>
+              <w:t>[RF0</w:t>
+            </w:r>
+            <w:r>
+              <w:rPr>
+                <w:rFonts w:ascii="Arial" w:hAnsi="Arial" w:cs="Arial"/>
+              </w:rPr>
+              <w:t>3</w:t>
+            </w:r>
+            <w:r>
+              <w:rPr>
+                <w:rFonts w:ascii="Arial" w:hAnsi="Arial" w:cs="Arial"/>
+              </w:rPr>
+              <w:t>3</w:t>
+            </w:r>
+            <w:r>
+              <w:rPr>
+                <w:rFonts w:ascii="Arial" w:hAnsi="Arial" w:cs="Arial"/>
+              </w:rPr>
+              <w:t xml:space="preserve">] </w:t>
+            </w:r>
+            <w:r>
+              <w:rPr>
+                <w:rFonts w:ascii="Arial" w:hAnsi="Arial" w:cs="Arial"/>
+              </w:rPr>
+              <w:t xml:space="preserve">Buscar texto norteador </w:t>
+            </w:r>
+            <w:proofErr w:type="gramStart"/>
+            <w:r>
+              <w:rPr>
+                <w:rFonts w:ascii="Arial" w:hAnsi="Arial" w:cs="Arial"/>
+              </w:rPr>
+              <w:t>no  banco</w:t>
+            </w:r>
+            <w:proofErr w:type="gramEnd"/>
+            <w:r>
+              <w:rPr>
+                <w:rFonts w:ascii="Arial" w:hAnsi="Arial" w:cs="Arial"/>
+              </w:rPr>
+              <w:t xml:space="preserve"> de dados</w:t>
             </w:r>
           </w:p>
         </w:tc>
@@ -3021,14 +3384,6 @@
               </w:rPr>
             </w:pPr>
           </w:p>
-          <w:p>
-            <w:pPr>
-              <w:jc w:val="both"/>
-              <w:rPr>
-                <w:rFonts w:ascii="Arial" w:hAnsi="Arial" w:cs="Arial"/>
-              </w:rPr>
-            </w:pPr>
-          </w:p>
         </w:tc>
         <w:tc>
           <w:tcPr>
@@ -3041,12 +3396,6 @@
                 <w:rFonts w:ascii="Arial" w:hAnsi="Arial" w:cs="Arial"/>
               </w:rPr>
             </w:pPr>
-            <w:r>
-              <w:rPr>
-                <w:rFonts w:ascii="Arial" w:hAnsi="Arial" w:cs="Arial"/>
-              </w:rPr>
-              <w:t>Alta</w:t>
-            </w:r>
           </w:p>
         </w:tc>
       </w:tr>
@@ -3069,7 +3418,33 @@
               <w:rPr>
                 <w:rFonts w:ascii="Arial" w:hAnsi="Arial" w:cs="Arial"/>
               </w:rPr>
-              <w:t>[RF034] Prover exibição de menu principal no site</w:t>
+              <w:t>[RF0</w:t>
+            </w:r>
+            <w:r>
+              <w:rPr>
+                <w:rFonts w:ascii="Arial" w:hAnsi="Arial" w:cs="Arial"/>
+              </w:rPr>
+              <w:t>3</w:t>
+            </w:r>
+            <w:r>
+              <w:rPr>
+                <w:rFonts w:ascii="Arial" w:hAnsi="Arial" w:cs="Arial"/>
+              </w:rPr>
+              <w:t>4</w:t>
+            </w:r>
+            <w:proofErr w:type="gramStart"/>
+            <w:r>
+              <w:rPr>
+                <w:rFonts w:ascii="Arial" w:hAnsi="Arial" w:cs="Arial"/>
+              </w:rPr>
+              <w:t>] Prover</w:t>
+            </w:r>
+            <w:proofErr w:type="gramEnd"/>
+            <w:r>
+              <w:rPr>
+                <w:rFonts w:ascii="Arial" w:hAnsi="Arial" w:cs="Arial"/>
+              </w:rPr>
+              <w:t xml:space="preserve"> tela de exibição de texto norteador do tema escolhido</w:t>
             </w:r>
           </w:p>
         </w:tc>
@@ -3084,6 +3459,12 @@
                 <w:rFonts w:ascii="Arial" w:hAnsi="Arial" w:cs="Arial"/>
               </w:rPr>
             </w:pPr>
+            <w:r>
+              <w:rPr>
+                <w:rFonts w:ascii="Arial" w:hAnsi="Arial" w:cs="Arial"/>
+              </w:rPr>
+              <w:t>Após o usuário escolher um tema, a tela mostrará textos explicativos ou norteadores relacionados, que poderão ser rolados ou expandidos. Cada texto terá título e conteúdo resumido</w:t>
+            </w:r>
           </w:p>
           <w:p>
             <w:pPr>
@@ -3109,7 +3490,7 @@
               <w:rPr>
                 <w:rFonts w:ascii="Arial" w:hAnsi="Arial" w:cs="Arial"/>
               </w:rPr>
-              <w:t>Alta</w:t>
+              <w:t>Baixa</w:t>
             </w:r>
           </w:p>
         </w:tc>
@@ -3133,7 +3514,1495 @@
               <w:rPr>
                 <w:rFonts w:ascii="Arial" w:hAnsi="Arial" w:cs="Arial"/>
               </w:rPr>
-              <w:t>[RF035] Prover exibição de menu secundário no site</w:t>
+              <w:t>[RF0</w:t>
+            </w:r>
+            <w:r>
+              <w:rPr>
+                <w:rFonts w:ascii="Arial" w:hAnsi="Arial" w:cs="Arial"/>
+              </w:rPr>
+              <w:t>3</w:t>
+            </w:r>
+            <w:r>
+              <w:rPr>
+                <w:rFonts w:ascii="Arial" w:hAnsi="Arial" w:cs="Arial"/>
+              </w:rPr>
+              <w:t>5</w:t>
+            </w:r>
+            <w:proofErr w:type="gramStart"/>
+            <w:r>
+              <w:rPr>
+                <w:rFonts w:ascii="Arial" w:hAnsi="Arial" w:cs="Arial"/>
+              </w:rPr>
+              <w:t>] C</w:t>
+            </w:r>
+            <w:r>
+              <w:rPr>
+                <w:rFonts w:ascii="Arial" w:hAnsi="Arial" w:cs="Arial"/>
+              </w:rPr>
+              <w:t>arregar</w:t>
+            </w:r>
+            <w:proofErr w:type="gramEnd"/>
+            <w:r>
+              <w:rPr>
+                <w:rFonts w:ascii="Arial" w:hAnsi="Arial" w:cs="Arial"/>
+              </w:rPr>
+              <w:t xml:space="preserve"> opção de redação selecionada</w:t>
+            </w:r>
+            <w:r>
+              <w:rPr>
+                <w:rFonts w:ascii="Arial" w:hAnsi="Arial" w:cs="Arial"/>
+              </w:rPr>
+              <w:t xml:space="preserve"> </w:t>
+            </w:r>
+          </w:p>
+        </w:tc>
+        <w:tc>
+          <w:tcPr>
+            <w:tcW w:w="4334" w:type="dxa"/>
+          </w:tcPr>
+          <w:p>
+            <w:pPr>
+              <w:jc w:val="both"/>
+              <w:rPr>
+                <w:rFonts w:ascii="Arial" w:hAnsi="Arial" w:cs="Arial"/>
+              </w:rPr>
+            </w:pPr>
+          </w:p>
+        </w:tc>
+        <w:tc>
+          <w:tcPr>
+            <w:tcW w:w="1305" w:type="dxa"/>
+          </w:tcPr>
+          <w:p>
+            <w:pPr>
+              <w:jc w:val="both"/>
+              <w:rPr>
+                <w:rFonts w:ascii="Arial" w:hAnsi="Arial" w:cs="Arial"/>
+              </w:rPr>
+            </w:pPr>
+          </w:p>
+        </w:tc>
+      </w:tr>
+      <w:tr>
+        <w:trPr>
+          <w:trHeight w:val="895"/>
+        </w:trPr>
+        <w:tc>
+          <w:tcPr>
+            <w:tcW w:w="2969" w:type="dxa"/>
+          </w:tcPr>
+          <w:p>
+            <w:pPr>
+              <w:jc w:val="both"/>
+              <w:rPr>
+                <w:rFonts w:ascii="Arial" w:hAnsi="Arial" w:cs="Arial"/>
+              </w:rPr>
+            </w:pPr>
+            <w:r>
+              <w:rPr>
+                <w:rFonts w:ascii="Arial" w:hAnsi="Arial" w:cs="Arial"/>
+              </w:rPr>
+              <w:t>[RF0</w:t>
+            </w:r>
+            <w:r>
+              <w:rPr>
+                <w:rFonts w:ascii="Arial" w:hAnsi="Arial" w:cs="Arial"/>
+              </w:rPr>
+              <w:t>3</w:t>
+            </w:r>
+            <w:r>
+              <w:rPr>
+                <w:rFonts w:ascii="Arial" w:hAnsi="Arial" w:cs="Arial"/>
+              </w:rPr>
+              <w:t>6</w:t>
+            </w:r>
+            <w:proofErr w:type="gramStart"/>
+            <w:r>
+              <w:rPr>
+                <w:rFonts w:ascii="Arial" w:hAnsi="Arial" w:cs="Arial"/>
+              </w:rPr>
+              <w:t>] Prover</w:t>
+            </w:r>
+            <w:proofErr w:type="gramEnd"/>
+            <w:r>
+              <w:rPr>
+                <w:rFonts w:ascii="Arial" w:hAnsi="Arial" w:cs="Arial"/>
+              </w:rPr>
+              <w:t xml:space="preserve"> tela de ambiente para produção de redação</w:t>
+            </w:r>
+          </w:p>
+        </w:tc>
+        <w:tc>
+          <w:tcPr>
+            <w:tcW w:w="4334" w:type="dxa"/>
+          </w:tcPr>
+          <w:p>
+            <w:pPr>
+              <w:jc w:val="both"/>
+              <w:rPr>
+                <w:rFonts w:ascii="Arial" w:hAnsi="Arial" w:cs="Arial"/>
+              </w:rPr>
+            </w:pPr>
+            <w:r>
+              <w:rPr>
+                <w:rFonts w:ascii="Arial" w:hAnsi="Arial" w:cs="Arial"/>
+              </w:rPr>
+              <w:t xml:space="preserve">[1] </w:t>
+            </w:r>
+            <w:r>
+              <w:rPr>
+                <w:rFonts w:ascii="Arial" w:hAnsi="Arial" w:cs="Arial"/>
+              </w:rPr>
+              <w:t xml:space="preserve">Tela com </w:t>
+            </w:r>
+            <w:r>
+              <w:rPr>
+                <w:rFonts w:ascii="Arial" w:hAnsi="Arial" w:cs="Arial"/>
+              </w:rPr>
+              <w:t>campos para digitar título e texto de redação com</w:t>
+            </w:r>
+            <w:r>
+              <w:rPr>
+                <w:rFonts w:ascii="Arial" w:hAnsi="Arial" w:cs="Arial"/>
+              </w:rPr>
+              <w:t xml:space="preserve"> contagem de caracteres</w:t>
+            </w:r>
+            <w:r>
+              <w:rPr>
+                <w:rFonts w:ascii="Arial" w:hAnsi="Arial" w:cs="Arial"/>
+              </w:rPr>
+              <w:t xml:space="preserve">. Além de </w:t>
+            </w:r>
+            <w:r>
+              <w:rPr>
+                <w:rFonts w:ascii="Arial" w:hAnsi="Arial" w:cs="Arial"/>
+              </w:rPr>
+              <w:t>botões</w:t>
+            </w:r>
+            <w:r>
+              <w:rPr>
+                <w:rFonts w:ascii="Arial" w:hAnsi="Arial" w:cs="Arial"/>
+              </w:rPr>
+              <w:t>: “</w:t>
+            </w:r>
+            <w:r>
+              <w:rPr>
+                <w:rFonts w:ascii="Arial" w:hAnsi="Arial" w:cs="Arial"/>
+              </w:rPr>
+              <w:t>Salvar</w:t>
+            </w:r>
+            <w:r>
+              <w:rPr>
+                <w:rFonts w:ascii="Arial" w:hAnsi="Arial" w:cs="Arial"/>
+              </w:rPr>
+              <w:t>”</w:t>
+            </w:r>
+            <w:r>
+              <w:rPr>
+                <w:rFonts w:ascii="Arial" w:hAnsi="Arial" w:cs="Arial"/>
+              </w:rPr>
+              <w:t xml:space="preserve">, </w:t>
+            </w:r>
+            <w:r>
+              <w:rPr>
+                <w:rFonts w:ascii="Arial" w:hAnsi="Arial" w:cs="Arial"/>
+              </w:rPr>
+              <w:t>“</w:t>
+            </w:r>
+            <w:r>
+              <w:rPr>
+                <w:rFonts w:ascii="Arial" w:hAnsi="Arial" w:cs="Arial"/>
+              </w:rPr>
+              <w:t>Enviar</w:t>
+            </w:r>
+            <w:r>
+              <w:rPr>
+                <w:rFonts w:ascii="Arial" w:hAnsi="Arial" w:cs="Arial"/>
+              </w:rPr>
+              <w:t>” e “Voltar”</w:t>
+            </w:r>
+            <w:r>
+              <w:rPr>
+                <w:rFonts w:ascii="Arial" w:hAnsi="Arial" w:cs="Arial"/>
+              </w:rPr>
+              <w:t>.</w:t>
+            </w:r>
+          </w:p>
+          <w:p>
+            <w:pPr>
+              <w:jc w:val="both"/>
+              <w:rPr>
+                <w:rFonts w:ascii="Arial" w:hAnsi="Arial" w:cs="Arial"/>
+              </w:rPr>
+            </w:pPr>
+          </w:p>
+          <w:p>
+            <w:pPr>
+              <w:jc w:val="both"/>
+              <w:rPr>
+                <w:rFonts w:ascii="Arial" w:hAnsi="Arial" w:cs="Arial"/>
+              </w:rPr>
+            </w:pPr>
+            <w:r>
+              <w:rPr>
+                <w:rFonts w:ascii="Arial" w:hAnsi="Arial" w:cs="Arial"/>
+              </w:rPr>
+              <w:t xml:space="preserve">[2] </w:t>
+            </w:r>
+            <w:r>
+              <w:rPr>
+                <w:rFonts w:ascii="Arial" w:hAnsi="Arial" w:cs="Arial"/>
+              </w:rPr>
+              <w:t xml:space="preserve">Tela com </w:t>
+            </w:r>
+            <w:r>
+              <w:rPr>
+                <w:rFonts w:ascii="Arial" w:hAnsi="Arial" w:cs="Arial"/>
+              </w:rPr>
+              <w:t xml:space="preserve">campo para digitar título e botão de seleção de arquivo de redação local. Além de </w:t>
+            </w:r>
+            <w:r>
+              <w:rPr>
+                <w:rFonts w:ascii="Arial" w:hAnsi="Arial" w:cs="Arial"/>
+              </w:rPr>
+              <w:t>botões</w:t>
+            </w:r>
+            <w:r>
+              <w:rPr>
+                <w:rFonts w:ascii="Arial" w:hAnsi="Arial" w:cs="Arial"/>
+              </w:rPr>
+              <w:t>: “</w:t>
+            </w:r>
+            <w:r>
+              <w:rPr>
+                <w:rFonts w:ascii="Arial" w:hAnsi="Arial" w:cs="Arial"/>
+              </w:rPr>
+              <w:t>Salvar</w:t>
+            </w:r>
+            <w:r>
+              <w:rPr>
+                <w:rFonts w:ascii="Arial" w:hAnsi="Arial" w:cs="Arial"/>
+              </w:rPr>
+              <w:t>”</w:t>
+            </w:r>
+            <w:r>
+              <w:rPr>
+                <w:rFonts w:ascii="Arial" w:hAnsi="Arial" w:cs="Arial"/>
+              </w:rPr>
+              <w:t xml:space="preserve">, </w:t>
+            </w:r>
+            <w:r>
+              <w:rPr>
+                <w:rFonts w:ascii="Arial" w:hAnsi="Arial" w:cs="Arial"/>
+              </w:rPr>
+              <w:t>“</w:t>
+            </w:r>
+            <w:r>
+              <w:rPr>
+                <w:rFonts w:ascii="Arial" w:hAnsi="Arial" w:cs="Arial"/>
+              </w:rPr>
+              <w:t>Enviar</w:t>
+            </w:r>
+            <w:r>
+              <w:rPr>
+                <w:rFonts w:ascii="Arial" w:hAnsi="Arial" w:cs="Arial"/>
+              </w:rPr>
+              <w:t>” e “Voltar”</w:t>
+            </w:r>
+            <w:r>
+              <w:rPr>
+                <w:rFonts w:ascii="Arial" w:hAnsi="Arial" w:cs="Arial"/>
+              </w:rPr>
+              <w:t>.</w:t>
+            </w:r>
+          </w:p>
+          <w:p>
+            <w:pPr>
+              <w:jc w:val="both"/>
+              <w:rPr>
+                <w:rFonts w:ascii="Arial" w:hAnsi="Arial" w:cs="Arial"/>
+              </w:rPr>
+            </w:pPr>
+          </w:p>
+          <w:p>
+            <w:pPr>
+              <w:jc w:val="both"/>
+              <w:rPr>
+                <w:rFonts w:ascii="Arial" w:hAnsi="Arial" w:cs="Arial"/>
+              </w:rPr>
+            </w:pPr>
+          </w:p>
+        </w:tc>
+        <w:tc>
+          <w:tcPr>
+            <w:tcW w:w="1305" w:type="dxa"/>
+          </w:tcPr>
+          <w:p>
+            <w:pPr>
+              <w:jc w:val="both"/>
+              <w:rPr>
+                <w:rFonts w:ascii="Arial" w:hAnsi="Arial" w:cs="Arial"/>
+              </w:rPr>
+            </w:pPr>
+            <w:r>
+              <w:rPr>
+                <w:rFonts w:ascii="Arial" w:hAnsi="Arial" w:cs="Arial"/>
+              </w:rPr>
+              <w:t>Alta</w:t>
+            </w:r>
+          </w:p>
+        </w:tc>
+      </w:tr>
+      <w:tr>
+        <w:trPr>
+          <w:trHeight w:val="895"/>
+        </w:trPr>
+        <w:tc>
+          <w:tcPr>
+            <w:tcW w:w="2969" w:type="dxa"/>
+          </w:tcPr>
+          <w:p>
+            <w:pPr>
+              <w:jc w:val="both"/>
+              <w:rPr>
+                <w:rFonts w:ascii="Arial" w:hAnsi="Arial" w:cs="Arial"/>
+              </w:rPr>
+            </w:pPr>
+            <w:r>
+              <w:rPr>
+                <w:rFonts w:ascii="Arial" w:hAnsi="Arial" w:cs="Arial"/>
+              </w:rPr>
+              <w:t>[RF0</w:t>
+            </w:r>
+            <w:r>
+              <w:rPr>
+                <w:rFonts w:ascii="Arial" w:hAnsi="Arial" w:cs="Arial"/>
+              </w:rPr>
+              <w:t>3</w:t>
+            </w:r>
+            <w:r>
+              <w:rPr>
+                <w:rFonts w:ascii="Arial" w:hAnsi="Arial" w:cs="Arial"/>
+              </w:rPr>
+              <w:t>7</w:t>
+            </w:r>
+            <w:proofErr w:type="gramStart"/>
+            <w:r>
+              <w:rPr>
+                <w:rFonts w:ascii="Arial" w:hAnsi="Arial" w:cs="Arial"/>
+              </w:rPr>
+              <w:t xml:space="preserve">] </w:t>
+            </w:r>
+            <w:r>
+              <w:rPr>
+                <w:rFonts w:ascii="Arial" w:hAnsi="Arial" w:cs="Arial"/>
+              </w:rPr>
+              <w:t>Salvar</w:t>
+            </w:r>
+            <w:proofErr w:type="gramEnd"/>
+            <w:r>
+              <w:rPr>
+                <w:rFonts w:ascii="Arial" w:hAnsi="Arial" w:cs="Arial"/>
+              </w:rPr>
+              <w:t xml:space="preserve"> redação digitada no banco de dados</w:t>
+            </w:r>
+          </w:p>
+        </w:tc>
+        <w:tc>
+          <w:tcPr>
+            <w:tcW w:w="4334" w:type="dxa"/>
+          </w:tcPr>
+          <w:p>
+            <w:pPr>
+              <w:jc w:val="both"/>
+              <w:rPr>
+                <w:rFonts w:ascii="Arial" w:hAnsi="Arial" w:cs="Arial"/>
+              </w:rPr>
+            </w:pPr>
+          </w:p>
+        </w:tc>
+        <w:tc>
+          <w:tcPr>
+            <w:tcW w:w="1305" w:type="dxa"/>
+          </w:tcPr>
+          <w:p>
+            <w:pPr>
+              <w:jc w:val="both"/>
+              <w:rPr>
+                <w:rFonts w:ascii="Arial" w:hAnsi="Arial" w:cs="Arial"/>
+              </w:rPr>
+            </w:pPr>
+          </w:p>
+        </w:tc>
+      </w:tr>
+      <w:tr>
+        <w:trPr>
+          <w:trHeight w:val="895"/>
+        </w:trPr>
+        <w:tc>
+          <w:tcPr>
+            <w:tcW w:w="2969" w:type="dxa"/>
+          </w:tcPr>
+          <w:p>
+            <w:pPr>
+              <w:jc w:val="both"/>
+              <w:rPr>
+                <w:rFonts w:ascii="Arial" w:hAnsi="Arial" w:cs="Arial"/>
+              </w:rPr>
+            </w:pPr>
+            <w:r>
+              <w:rPr>
+                <w:rFonts w:ascii="Arial" w:hAnsi="Arial" w:cs="Arial"/>
+              </w:rPr>
+              <w:t>[RF0</w:t>
+            </w:r>
+            <w:r>
+              <w:rPr>
+                <w:rFonts w:ascii="Arial" w:hAnsi="Arial" w:cs="Arial"/>
+              </w:rPr>
+              <w:t>3</w:t>
+            </w:r>
+            <w:r>
+              <w:rPr>
+                <w:rFonts w:ascii="Arial" w:hAnsi="Arial" w:cs="Arial"/>
+              </w:rPr>
+              <w:t>8</w:t>
+            </w:r>
+            <w:proofErr w:type="gramStart"/>
+            <w:r>
+              <w:rPr>
+                <w:rFonts w:ascii="Arial" w:hAnsi="Arial" w:cs="Arial"/>
+              </w:rPr>
+              <w:t xml:space="preserve">] </w:t>
+            </w:r>
+            <w:r>
+              <w:rPr>
+                <w:rFonts w:ascii="Arial" w:hAnsi="Arial" w:cs="Arial"/>
+              </w:rPr>
+              <w:t>Buscar</w:t>
+            </w:r>
+            <w:proofErr w:type="gramEnd"/>
+            <w:r>
+              <w:rPr>
+                <w:rFonts w:ascii="Arial" w:hAnsi="Arial" w:cs="Arial"/>
+              </w:rPr>
+              <w:t xml:space="preserve"> redação salva no banco de dados</w:t>
+            </w:r>
+          </w:p>
+        </w:tc>
+        <w:tc>
+          <w:tcPr>
+            <w:tcW w:w="4334" w:type="dxa"/>
+          </w:tcPr>
+          <w:p>
+            <w:pPr>
+              <w:jc w:val="both"/>
+              <w:rPr>
+                <w:rFonts w:ascii="Arial" w:hAnsi="Arial" w:cs="Arial"/>
+              </w:rPr>
+            </w:pPr>
+          </w:p>
+        </w:tc>
+        <w:tc>
+          <w:tcPr>
+            <w:tcW w:w="1305" w:type="dxa"/>
+          </w:tcPr>
+          <w:p>
+            <w:pPr>
+              <w:jc w:val="both"/>
+              <w:rPr>
+                <w:rFonts w:ascii="Arial" w:hAnsi="Arial" w:cs="Arial"/>
+              </w:rPr>
+            </w:pPr>
+          </w:p>
+        </w:tc>
+      </w:tr>
+      <w:tr>
+        <w:trPr>
+          <w:trHeight w:val="895"/>
+        </w:trPr>
+        <w:tc>
+          <w:tcPr>
+            <w:tcW w:w="2969" w:type="dxa"/>
+          </w:tcPr>
+          <w:p>
+            <w:pPr>
+              <w:jc w:val="both"/>
+              <w:rPr>
+                <w:rFonts w:ascii="Arial" w:hAnsi="Arial" w:cs="Arial"/>
+              </w:rPr>
+            </w:pPr>
+            <w:r>
+              <w:rPr>
+                <w:rFonts w:ascii="Arial" w:hAnsi="Arial" w:cs="Arial"/>
+              </w:rPr>
+              <w:t>[RF0</w:t>
+            </w:r>
+            <w:r>
+              <w:rPr>
+                <w:rFonts w:ascii="Arial" w:hAnsi="Arial" w:cs="Arial"/>
+              </w:rPr>
+              <w:t>39</w:t>
+            </w:r>
+            <w:proofErr w:type="gramStart"/>
+            <w:r>
+              <w:rPr>
+                <w:rFonts w:ascii="Arial" w:hAnsi="Arial" w:cs="Arial"/>
+              </w:rPr>
+              <w:t>] Prover</w:t>
+            </w:r>
+            <w:proofErr w:type="gramEnd"/>
+            <w:r>
+              <w:rPr>
+                <w:rFonts w:ascii="Arial" w:hAnsi="Arial" w:cs="Arial"/>
+              </w:rPr>
+              <w:t xml:space="preserve"> tela de seleção de redação salva</w:t>
+            </w:r>
+          </w:p>
+        </w:tc>
+        <w:tc>
+          <w:tcPr>
+            <w:tcW w:w="4334" w:type="dxa"/>
+          </w:tcPr>
+          <w:p>
+            <w:pPr>
+              <w:jc w:val="both"/>
+              <w:rPr>
+                <w:rFonts w:ascii="Arial" w:hAnsi="Arial" w:cs="Arial"/>
+                <w:u w:val="single"/>
+              </w:rPr>
+            </w:pPr>
+            <w:r>
+              <w:rPr>
+                <w:rFonts w:ascii="Arial" w:hAnsi="Arial" w:cs="Arial"/>
+              </w:rPr>
+              <w:t>Tela exibirá todas as redações já salvas pelo usuário</w:t>
+            </w:r>
+          </w:p>
+          <w:p>
+            <w:pPr>
+              <w:jc w:val="both"/>
+              <w:rPr>
+                <w:rFonts w:ascii="Arial" w:hAnsi="Arial" w:cs="Arial"/>
+              </w:rPr>
+            </w:pPr>
+          </w:p>
+        </w:tc>
+        <w:tc>
+          <w:tcPr>
+            <w:tcW w:w="1305" w:type="dxa"/>
+          </w:tcPr>
+          <w:p>
+            <w:pPr>
+              <w:jc w:val="both"/>
+              <w:rPr>
+                <w:rFonts w:ascii="Arial" w:hAnsi="Arial" w:cs="Arial"/>
+              </w:rPr>
+            </w:pPr>
+            <w:r>
+              <w:rPr>
+                <w:rFonts w:ascii="Arial" w:hAnsi="Arial" w:cs="Arial"/>
+              </w:rPr>
+              <w:t>Média</w:t>
+            </w:r>
+          </w:p>
+        </w:tc>
+      </w:tr>
+      <w:tr>
+        <w:trPr>
+          <w:trHeight w:val="895"/>
+        </w:trPr>
+        <w:tc>
+          <w:tcPr>
+            <w:tcW w:w="2969" w:type="dxa"/>
+          </w:tcPr>
+          <w:p>
+            <w:pPr>
+              <w:jc w:val="both"/>
+              <w:rPr>
+                <w:rFonts w:ascii="Arial" w:hAnsi="Arial" w:cs="Arial"/>
+              </w:rPr>
+            </w:pPr>
+            <w:r>
+              <w:rPr>
+                <w:rFonts w:ascii="Arial" w:hAnsi="Arial" w:cs="Arial"/>
+              </w:rPr>
+              <w:lastRenderedPageBreak/>
+              <w:t>[RF0</w:t>
+            </w:r>
+            <w:r>
+              <w:rPr>
+                <w:rFonts w:ascii="Arial" w:hAnsi="Arial" w:cs="Arial"/>
+              </w:rPr>
+              <w:t>4</w:t>
+            </w:r>
+            <w:r>
+              <w:rPr>
+                <w:rFonts w:ascii="Arial" w:hAnsi="Arial" w:cs="Arial"/>
+              </w:rPr>
+              <w:t>0</w:t>
+            </w:r>
+            <w:r>
+              <w:rPr>
+                <w:rFonts w:ascii="Arial" w:hAnsi="Arial" w:cs="Arial"/>
+              </w:rPr>
+              <w:t>] Correção de redação pela IA</w:t>
+            </w:r>
+          </w:p>
+        </w:tc>
+        <w:tc>
+          <w:tcPr>
+            <w:tcW w:w="4334" w:type="dxa"/>
+          </w:tcPr>
+          <w:p>
+            <w:pPr>
+              <w:jc w:val="both"/>
+              <w:rPr>
+                <w:rFonts w:ascii="Arial" w:hAnsi="Arial" w:cs="Arial"/>
+              </w:rPr>
+            </w:pPr>
+          </w:p>
+        </w:tc>
+        <w:tc>
+          <w:tcPr>
+            <w:tcW w:w="1305" w:type="dxa"/>
+          </w:tcPr>
+          <w:p>
+            <w:pPr>
+              <w:jc w:val="both"/>
+              <w:rPr>
+                <w:rFonts w:ascii="Arial" w:hAnsi="Arial" w:cs="Arial"/>
+              </w:rPr>
+            </w:pPr>
+          </w:p>
+        </w:tc>
+      </w:tr>
+      <w:tr>
+        <w:trPr>
+          <w:trHeight w:val="895"/>
+        </w:trPr>
+        <w:tc>
+          <w:tcPr>
+            <w:tcW w:w="2969" w:type="dxa"/>
+          </w:tcPr>
+          <w:p>
+            <w:pPr>
+              <w:jc w:val="both"/>
+              <w:rPr>
+                <w:rFonts w:ascii="Arial" w:hAnsi="Arial" w:cs="Arial"/>
+              </w:rPr>
+            </w:pPr>
+            <w:r>
+              <w:rPr>
+                <w:rFonts w:ascii="Arial" w:hAnsi="Arial" w:cs="Arial"/>
+              </w:rPr>
+              <w:t>[RF0</w:t>
+            </w:r>
+            <w:r>
+              <w:rPr>
+                <w:rFonts w:ascii="Arial" w:hAnsi="Arial" w:cs="Arial"/>
+              </w:rPr>
+              <w:t>4</w:t>
+            </w:r>
+            <w:r>
+              <w:rPr>
+                <w:rFonts w:ascii="Arial" w:hAnsi="Arial" w:cs="Arial"/>
+              </w:rPr>
+              <w:t>1</w:t>
+            </w:r>
+            <w:proofErr w:type="gramStart"/>
+            <w:r>
+              <w:rPr>
+                <w:rFonts w:ascii="Arial" w:hAnsi="Arial" w:cs="Arial"/>
+              </w:rPr>
+              <w:t>]</w:t>
+            </w:r>
+            <w:r>
+              <w:rPr>
+                <w:rFonts w:ascii="Arial" w:hAnsi="Arial" w:cs="Arial"/>
+              </w:rPr>
+              <w:t xml:space="preserve"> </w:t>
+            </w:r>
+            <w:r>
+              <w:rPr>
+                <w:rFonts w:ascii="Arial" w:hAnsi="Arial" w:cs="Arial"/>
+              </w:rPr>
+              <w:t>Prover</w:t>
+            </w:r>
+            <w:proofErr w:type="gramEnd"/>
+            <w:r>
+              <w:rPr>
+                <w:rFonts w:ascii="Arial" w:hAnsi="Arial" w:cs="Arial"/>
+              </w:rPr>
+              <w:t xml:space="preserve"> tela carregamento de correção automática por IA</w:t>
+            </w:r>
+          </w:p>
+          <w:p>
+            <w:pPr>
+              <w:jc w:val="both"/>
+              <w:rPr>
+                <w:rFonts w:ascii="Arial" w:hAnsi="Arial" w:cs="Arial"/>
+              </w:rPr>
+            </w:pPr>
+          </w:p>
+        </w:tc>
+        <w:tc>
+          <w:tcPr>
+            <w:tcW w:w="4334" w:type="dxa"/>
+          </w:tcPr>
+          <w:p>
+            <w:pPr>
+              <w:jc w:val="both"/>
+              <w:rPr>
+                <w:rFonts w:ascii="Arial" w:hAnsi="Arial" w:cs="Arial"/>
+              </w:rPr>
+            </w:pPr>
+            <w:r>
+              <w:rPr>
+                <w:rFonts w:ascii="Arial" w:hAnsi="Arial" w:cs="Arial"/>
+              </w:rPr>
+              <w:t>Após envio da redação, a IA fará a correção considerando semântica, sintaxe, gramática e ortografia. O usuário verá os pontos avaliados e possíveis erros destacados, seguindo as competências avaliadas pelo Inep.</w:t>
+            </w:r>
+          </w:p>
+          <w:p>
+            <w:pPr>
+              <w:jc w:val="both"/>
+              <w:rPr>
+                <w:rFonts w:ascii="Arial" w:hAnsi="Arial" w:cs="Arial"/>
+              </w:rPr>
+            </w:pPr>
+          </w:p>
+        </w:tc>
+        <w:tc>
+          <w:tcPr>
+            <w:tcW w:w="1305" w:type="dxa"/>
+          </w:tcPr>
+          <w:p>
+            <w:pPr>
+              <w:jc w:val="both"/>
+              <w:rPr>
+                <w:rFonts w:ascii="Arial" w:hAnsi="Arial" w:cs="Arial"/>
+              </w:rPr>
+            </w:pPr>
+            <w:r>
+              <w:rPr>
+                <w:rFonts w:ascii="Arial" w:hAnsi="Arial" w:cs="Arial"/>
+              </w:rPr>
+              <w:t>Alta</w:t>
+            </w:r>
+          </w:p>
+        </w:tc>
+      </w:tr>
+      <w:tr>
+        <w:trPr>
+          <w:trHeight w:val="895"/>
+        </w:trPr>
+        <w:tc>
+          <w:tcPr>
+            <w:tcW w:w="2969" w:type="dxa"/>
+          </w:tcPr>
+          <w:p>
+            <w:pPr>
+              <w:jc w:val="both"/>
+              <w:rPr>
+                <w:rFonts w:ascii="Arial" w:hAnsi="Arial" w:cs="Arial"/>
+              </w:rPr>
+            </w:pPr>
+            <w:r>
+              <w:rPr>
+                <w:rFonts w:ascii="Arial" w:hAnsi="Arial" w:cs="Arial"/>
+              </w:rPr>
+              <w:t>[RF0</w:t>
+            </w:r>
+            <w:r>
+              <w:rPr>
+                <w:rFonts w:ascii="Arial" w:hAnsi="Arial" w:cs="Arial"/>
+              </w:rPr>
+              <w:t>4</w:t>
+            </w:r>
+            <w:r>
+              <w:rPr>
+                <w:rFonts w:ascii="Arial" w:hAnsi="Arial" w:cs="Arial"/>
+              </w:rPr>
+              <w:t>2</w:t>
+            </w:r>
+            <w:proofErr w:type="gramStart"/>
+            <w:r>
+              <w:rPr>
+                <w:rFonts w:ascii="Arial" w:hAnsi="Arial" w:cs="Arial"/>
+              </w:rPr>
+              <w:t xml:space="preserve">] </w:t>
+            </w:r>
+            <w:r>
+              <w:rPr>
+                <w:rFonts w:ascii="Arial" w:hAnsi="Arial" w:cs="Arial"/>
+              </w:rPr>
+              <w:t>Salvar</w:t>
+            </w:r>
+            <w:proofErr w:type="gramEnd"/>
+            <w:r>
+              <w:rPr>
+                <w:rFonts w:ascii="Arial" w:hAnsi="Arial" w:cs="Arial"/>
+              </w:rPr>
+              <w:t xml:space="preserve"> redação corrigida no banco de dados </w:t>
+            </w:r>
+          </w:p>
+        </w:tc>
+        <w:tc>
+          <w:tcPr>
+            <w:tcW w:w="4334" w:type="dxa"/>
+          </w:tcPr>
+          <w:p>
+            <w:pPr>
+              <w:jc w:val="both"/>
+              <w:rPr>
+                <w:rFonts w:ascii="Arial" w:hAnsi="Arial" w:cs="Arial"/>
+              </w:rPr>
+            </w:pPr>
+          </w:p>
+        </w:tc>
+        <w:tc>
+          <w:tcPr>
+            <w:tcW w:w="1305" w:type="dxa"/>
+          </w:tcPr>
+          <w:p>
+            <w:pPr>
+              <w:jc w:val="both"/>
+              <w:rPr>
+                <w:rFonts w:ascii="Arial" w:hAnsi="Arial" w:cs="Arial"/>
+              </w:rPr>
+            </w:pPr>
+          </w:p>
+        </w:tc>
+      </w:tr>
+      <w:tr>
+        <w:trPr>
+          <w:trHeight w:val="895"/>
+        </w:trPr>
+        <w:tc>
+          <w:tcPr>
+            <w:tcW w:w="2969" w:type="dxa"/>
+          </w:tcPr>
+          <w:p>
+            <w:pPr>
+              <w:jc w:val="both"/>
+              <w:rPr>
+                <w:rFonts w:ascii="Arial" w:hAnsi="Arial" w:cs="Arial"/>
+              </w:rPr>
+            </w:pPr>
+            <w:r>
+              <w:rPr>
+                <w:rFonts w:ascii="Arial" w:hAnsi="Arial" w:cs="Arial"/>
+              </w:rPr>
+              <w:t>[RF0</w:t>
+            </w:r>
+            <w:r>
+              <w:rPr>
+                <w:rFonts w:ascii="Arial" w:hAnsi="Arial" w:cs="Arial"/>
+              </w:rPr>
+              <w:t>4</w:t>
+            </w:r>
+            <w:r>
+              <w:rPr>
+                <w:rFonts w:ascii="Arial" w:hAnsi="Arial" w:cs="Arial"/>
+              </w:rPr>
+              <w:t>3</w:t>
+            </w:r>
+            <w:proofErr w:type="gramStart"/>
+            <w:r>
+              <w:rPr>
+                <w:rFonts w:ascii="Arial" w:hAnsi="Arial" w:cs="Arial"/>
+              </w:rPr>
+              <w:t>]</w:t>
+            </w:r>
+            <w:r>
+              <w:rPr>
+                <w:rFonts w:ascii="Arial" w:hAnsi="Arial" w:cs="Arial"/>
+              </w:rPr>
+              <w:t xml:space="preserve"> </w:t>
+            </w:r>
+            <w:r>
+              <w:rPr>
+                <w:rFonts w:ascii="Arial" w:hAnsi="Arial" w:cs="Arial"/>
+              </w:rPr>
+              <w:t>Buscar</w:t>
+            </w:r>
+            <w:proofErr w:type="gramEnd"/>
+            <w:r>
+              <w:rPr>
+                <w:rFonts w:ascii="Arial" w:hAnsi="Arial" w:cs="Arial"/>
+              </w:rPr>
+              <w:t xml:space="preserve"> redações corrigidas no banco de dados</w:t>
+            </w:r>
+          </w:p>
+        </w:tc>
+        <w:tc>
+          <w:tcPr>
+            <w:tcW w:w="4334" w:type="dxa"/>
+          </w:tcPr>
+          <w:p>
+            <w:pPr>
+              <w:jc w:val="both"/>
+              <w:rPr>
+                <w:rFonts w:ascii="Arial" w:hAnsi="Arial" w:cs="Arial"/>
+              </w:rPr>
+            </w:pPr>
+          </w:p>
+        </w:tc>
+        <w:tc>
+          <w:tcPr>
+            <w:tcW w:w="1305" w:type="dxa"/>
+          </w:tcPr>
+          <w:p>
+            <w:pPr>
+              <w:jc w:val="both"/>
+              <w:rPr>
+                <w:rFonts w:ascii="Arial" w:hAnsi="Arial" w:cs="Arial"/>
+              </w:rPr>
+            </w:pPr>
+          </w:p>
+        </w:tc>
+      </w:tr>
+      <w:tr>
+        <w:trPr>
+          <w:trHeight w:val="895"/>
+        </w:trPr>
+        <w:tc>
+          <w:tcPr>
+            <w:tcW w:w="2969" w:type="dxa"/>
+          </w:tcPr>
+          <w:p>
+            <w:pPr>
+              <w:jc w:val="both"/>
+              <w:rPr>
+                <w:rFonts w:ascii="Arial" w:hAnsi="Arial" w:cs="Arial"/>
+              </w:rPr>
+            </w:pPr>
+            <w:r>
+              <w:rPr>
+                <w:rFonts w:ascii="Arial" w:hAnsi="Arial" w:cs="Arial"/>
+              </w:rPr>
+              <w:t>[RF0</w:t>
+            </w:r>
+            <w:r>
+              <w:rPr>
+                <w:rFonts w:ascii="Arial" w:hAnsi="Arial" w:cs="Arial"/>
+              </w:rPr>
+              <w:t>4</w:t>
+            </w:r>
+            <w:r>
+              <w:rPr>
+                <w:rFonts w:ascii="Arial" w:hAnsi="Arial" w:cs="Arial"/>
+              </w:rPr>
+              <w:t>4</w:t>
+            </w:r>
+            <w:proofErr w:type="gramStart"/>
+            <w:r>
+              <w:rPr>
+                <w:rFonts w:ascii="Arial" w:hAnsi="Arial" w:cs="Arial"/>
+              </w:rPr>
+              <w:t>] Prover</w:t>
+            </w:r>
+            <w:proofErr w:type="gramEnd"/>
+            <w:r>
+              <w:rPr>
+                <w:rFonts w:ascii="Arial" w:hAnsi="Arial" w:cs="Arial"/>
+              </w:rPr>
+              <w:t xml:space="preserve"> tela de histórico das redações</w:t>
+            </w:r>
+          </w:p>
+        </w:tc>
+        <w:tc>
+          <w:tcPr>
+            <w:tcW w:w="4334" w:type="dxa"/>
+          </w:tcPr>
+          <w:p>
+            <w:pPr>
+              <w:jc w:val="both"/>
+              <w:rPr>
+                <w:rFonts w:ascii="Arial" w:hAnsi="Arial" w:cs="Arial"/>
+              </w:rPr>
+            </w:pPr>
+            <w:r>
+              <w:rPr>
+                <w:rFonts w:ascii="Arial" w:hAnsi="Arial" w:cs="Arial"/>
+              </w:rPr>
+              <w:t>Tela exibirá todas as redações enviadas pelo usuário com data, tema, nota e link para visualização do texto e feedback.</w:t>
+            </w:r>
+          </w:p>
+          <w:p>
+            <w:pPr>
+              <w:jc w:val="both"/>
+              <w:rPr>
+                <w:rFonts w:ascii="Arial" w:hAnsi="Arial" w:cs="Arial"/>
+              </w:rPr>
+            </w:pPr>
+          </w:p>
+        </w:tc>
+        <w:tc>
+          <w:tcPr>
+            <w:tcW w:w="1305" w:type="dxa"/>
+          </w:tcPr>
+          <w:p>
+            <w:pPr>
+              <w:jc w:val="both"/>
+              <w:rPr>
+                <w:rFonts w:ascii="Arial" w:hAnsi="Arial" w:cs="Arial"/>
+              </w:rPr>
+            </w:pPr>
+            <w:r>
+              <w:rPr>
+                <w:rFonts w:ascii="Arial" w:hAnsi="Arial" w:cs="Arial"/>
+              </w:rPr>
+              <w:t>Alta</w:t>
+            </w:r>
+          </w:p>
+        </w:tc>
+      </w:tr>
+      <w:tr>
+        <w:trPr>
+          <w:trHeight w:val="895"/>
+        </w:trPr>
+        <w:tc>
+          <w:tcPr>
+            <w:tcW w:w="2969" w:type="dxa"/>
+          </w:tcPr>
+          <w:p>
+            <w:pPr>
+              <w:jc w:val="both"/>
+              <w:rPr>
+                <w:rFonts w:ascii="Arial" w:hAnsi="Arial" w:cs="Arial"/>
+              </w:rPr>
+            </w:pPr>
+            <w:r>
+              <w:rPr>
+                <w:rFonts w:ascii="Arial" w:hAnsi="Arial" w:cs="Arial"/>
+              </w:rPr>
+              <w:t>[RF0</w:t>
+            </w:r>
+            <w:r>
+              <w:rPr>
+                <w:rFonts w:ascii="Arial" w:hAnsi="Arial" w:cs="Arial"/>
+              </w:rPr>
+              <w:t>4</w:t>
+            </w:r>
+            <w:r>
+              <w:rPr>
+                <w:rFonts w:ascii="Arial" w:hAnsi="Arial" w:cs="Arial"/>
+              </w:rPr>
+              <w:t>5</w:t>
+            </w:r>
+            <w:proofErr w:type="gramStart"/>
+            <w:r>
+              <w:rPr>
+                <w:rFonts w:ascii="Arial" w:hAnsi="Arial" w:cs="Arial"/>
+              </w:rPr>
+              <w:t>] Prover</w:t>
+            </w:r>
+            <w:proofErr w:type="gramEnd"/>
+            <w:r>
+              <w:rPr>
+                <w:rFonts w:ascii="Arial" w:hAnsi="Arial" w:cs="Arial"/>
+              </w:rPr>
+              <w:t xml:space="preserve"> tela de descrição detalhada sobre a redação corrigida</w:t>
+            </w:r>
+          </w:p>
+        </w:tc>
+        <w:tc>
+          <w:tcPr>
+            <w:tcW w:w="4334" w:type="dxa"/>
+          </w:tcPr>
+          <w:p>
+            <w:pPr>
+              <w:jc w:val="both"/>
+              <w:rPr>
+                <w:rFonts w:ascii="Arial" w:hAnsi="Arial" w:cs="Arial"/>
+              </w:rPr>
+            </w:pPr>
+            <w:r>
+              <w:rPr>
+                <w:rFonts w:ascii="Arial" w:hAnsi="Arial" w:cs="Arial"/>
+              </w:rPr>
+              <w:t xml:space="preserve">Tela que exibirá a pontuação sobre cada </w:t>
+            </w:r>
+            <w:proofErr w:type="gramStart"/>
+            <w:r>
+              <w:rPr>
+                <w:rFonts w:ascii="Arial" w:hAnsi="Arial" w:cs="Arial"/>
+              </w:rPr>
+              <w:t>competência  com</w:t>
+            </w:r>
+            <w:proofErr w:type="gramEnd"/>
+            <w:r>
+              <w:rPr>
+                <w:rFonts w:ascii="Arial" w:hAnsi="Arial" w:cs="Arial"/>
+              </w:rPr>
+              <w:t xml:space="preserve"> a nota média final, feedback sobre cada competência, comentários, erros detalhados e sugestões de melhoria, Além de um botão para ler a redação. Redações que não foram corrigidas terão apenas o botão de abrir redação permitindo alteração </w:t>
+            </w:r>
+          </w:p>
+          <w:p>
+            <w:pPr>
+              <w:jc w:val="both"/>
+              <w:rPr>
+                <w:rFonts w:ascii="Arial" w:hAnsi="Arial" w:cs="Arial"/>
+              </w:rPr>
+            </w:pPr>
+          </w:p>
+        </w:tc>
+        <w:tc>
+          <w:tcPr>
+            <w:tcW w:w="1305" w:type="dxa"/>
+          </w:tcPr>
+          <w:p>
+            <w:pPr>
+              <w:jc w:val="both"/>
+              <w:rPr>
+                <w:rFonts w:ascii="Arial" w:hAnsi="Arial" w:cs="Arial"/>
+              </w:rPr>
+            </w:pPr>
+            <w:r>
+              <w:rPr>
+                <w:rFonts w:ascii="Arial" w:hAnsi="Arial" w:cs="Arial"/>
+              </w:rPr>
+              <w:t>Alta</w:t>
+            </w:r>
+          </w:p>
+        </w:tc>
+      </w:tr>
+      <w:tr>
+        <w:trPr>
+          <w:trHeight w:val="895"/>
+        </w:trPr>
+        <w:tc>
+          <w:tcPr>
+            <w:tcW w:w="2969" w:type="dxa"/>
+          </w:tcPr>
+          <w:p>
+            <w:pPr>
+              <w:jc w:val="both"/>
+              <w:rPr>
+                <w:rFonts w:ascii="Arial" w:hAnsi="Arial" w:cs="Arial"/>
+              </w:rPr>
+            </w:pPr>
+            <w:r>
+              <w:rPr>
+                <w:rFonts w:ascii="Arial" w:hAnsi="Arial" w:cs="Arial"/>
+              </w:rPr>
+              <w:t>[RF0</w:t>
+            </w:r>
+            <w:r>
+              <w:rPr>
+                <w:rFonts w:ascii="Arial" w:hAnsi="Arial" w:cs="Arial"/>
+              </w:rPr>
+              <w:t>4</w:t>
+            </w:r>
+            <w:r>
+              <w:rPr>
+                <w:rFonts w:ascii="Arial" w:hAnsi="Arial" w:cs="Arial"/>
+              </w:rPr>
+              <w:t>6</w:t>
+            </w:r>
+            <w:proofErr w:type="gramStart"/>
+            <w:r>
+              <w:rPr>
+                <w:rFonts w:ascii="Arial" w:hAnsi="Arial" w:cs="Arial"/>
+              </w:rPr>
+              <w:t>] Prover</w:t>
+            </w:r>
+            <w:proofErr w:type="gramEnd"/>
+            <w:r>
+              <w:rPr>
+                <w:rFonts w:ascii="Arial" w:hAnsi="Arial" w:cs="Arial"/>
+              </w:rPr>
+              <w:t xml:space="preserve"> tela com explicação da</w:t>
+            </w:r>
+            <w:r>
+              <w:rPr>
+                <w:rFonts w:ascii="Arial" w:hAnsi="Arial" w:cs="Arial"/>
+              </w:rPr>
+              <w:t>s</w:t>
+            </w:r>
+            <w:r>
+              <w:rPr>
+                <w:rFonts w:ascii="Arial" w:hAnsi="Arial" w:cs="Arial"/>
+              </w:rPr>
+              <w:t xml:space="preserve"> pontuaç</w:t>
+            </w:r>
+            <w:r>
+              <w:rPr>
+                <w:rFonts w:ascii="Arial" w:hAnsi="Arial" w:cs="Arial"/>
+              </w:rPr>
+              <w:t>ões</w:t>
+            </w:r>
+          </w:p>
+        </w:tc>
+        <w:tc>
+          <w:tcPr>
+            <w:tcW w:w="4334" w:type="dxa"/>
+          </w:tcPr>
+          <w:p>
+            <w:pPr>
+              <w:jc w:val="both"/>
+              <w:rPr>
+                <w:rFonts w:ascii="Arial" w:hAnsi="Arial" w:cs="Arial"/>
+              </w:rPr>
+            </w:pPr>
+          </w:p>
+          <w:p>
+            <w:pPr>
+              <w:jc w:val="both"/>
+              <w:rPr>
+                <w:rFonts w:ascii="Arial" w:hAnsi="Arial" w:cs="Arial"/>
+              </w:rPr>
+            </w:pPr>
+          </w:p>
+        </w:tc>
+        <w:tc>
+          <w:tcPr>
+            <w:tcW w:w="1305" w:type="dxa"/>
+          </w:tcPr>
+          <w:p>
+            <w:pPr>
+              <w:jc w:val="both"/>
+              <w:rPr>
+                <w:rFonts w:ascii="Arial" w:hAnsi="Arial" w:cs="Arial"/>
+              </w:rPr>
+            </w:pPr>
+            <w:r>
+              <w:rPr>
+                <w:rFonts w:ascii="Arial" w:hAnsi="Arial" w:cs="Arial"/>
+              </w:rPr>
+              <w:t>Baixa</w:t>
+            </w:r>
+          </w:p>
+        </w:tc>
+      </w:tr>
+      <w:tr>
+        <w:trPr>
+          <w:trHeight w:val="895"/>
+        </w:trPr>
+        <w:tc>
+          <w:tcPr>
+            <w:tcW w:w="2969" w:type="dxa"/>
+          </w:tcPr>
+          <w:p>
+            <w:pPr>
+              <w:jc w:val="both"/>
+              <w:rPr>
+                <w:rFonts w:ascii="Arial" w:hAnsi="Arial" w:cs="Arial"/>
+              </w:rPr>
+            </w:pPr>
+            <w:r>
+              <w:rPr>
+                <w:rFonts w:ascii="Arial" w:hAnsi="Arial" w:cs="Arial"/>
+              </w:rPr>
+              <w:t>[RF0</w:t>
+            </w:r>
+            <w:r>
+              <w:rPr>
+                <w:rFonts w:ascii="Arial" w:hAnsi="Arial" w:cs="Arial"/>
+              </w:rPr>
+              <w:t>4</w:t>
+            </w:r>
+            <w:r>
+              <w:rPr>
+                <w:rFonts w:ascii="Arial" w:hAnsi="Arial" w:cs="Arial"/>
+              </w:rPr>
+              <w:t>7</w:t>
+            </w:r>
+            <w:proofErr w:type="gramStart"/>
+            <w:r>
+              <w:rPr>
+                <w:rFonts w:ascii="Arial" w:hAnsi="Arial" w:cs="Arial"/>
+              </w:rPr>
+              <w:t>] Prover</w:t>
+            </w:r>
+            <w:proofErr w:type="gramEnd"/>
+            <w:r>
+              <w:rPr>
+                <w:rFonts w:ascii="Arial" w:hAnsi="Arial" w:cs="Arial"/>
+              </w:rPr>
+              <w:t xml:space="preserve"> tela de desempenho do usuário</w:t>
+            </w:r>
+          </w:p>
+        </w:tc>
+        <w:tc>
+          <w:tcPr>
+            <w:tcW w:w="4334" w:type="dxa"/>
+          </w:tcPr>
+          <w:p>
+            <w:pPr>
+              <w:jc w:val="both"/>
+              <w:rPr>
+                <w:rFonts w:ascii="Arial" w:hAnsi="Arial" w:cs="Arial"/>
+              </w:rPr>
+            </w:pPr>
+            <w:r>
+              <w:rPr>
+                <w:rFonts w:ascii="Arial" w:hAnsi="Arial" w:cs="Arial"/>
+              </w:rPr>
+              <w:t>Tela mostrará gráficos de evolução das redações, incluindo pontuações e erros recorrentes.</w:t>
+            </w:r>
+          </w:p>
+          <w:p>
+            <w:pPr>
+              <w:jc w:val="both"/>
+              <w:rPr>
+                <w:rFonts w:ascii="Arial" w:hAnsi="Arial" w:cs="Arial"/>
+              </w:rPr>
+            </w:pPr>
+          </w:p>
+        </w:tc>
+        <w:tc>
+          <w:tcPr>
+            <w:tcW w:w="1305" w:type="dxa"/>
+          </w:tcPr>
+          <w:p>
+            <w:pPr>
+              <w:jc w:val="both"/>
+              <w:rPr>
+                <w:rFonts w:ascii="Arial" w:hAnsi="Arial" w:cs="Arial"/>
+              </w:rPr>
+            </w:pPr>
+            <w:r>
+              <w:rPr>
+                <w:rFonts w:ascii="Arial" w:hAnsi="Arial" w:cs="Arial"/>
+              </w:rPr>
+              <w:t>Media</w:t>
+            </w:r>
+          </w:p>
+        </w:tc>
+      </w:tr>
+      <w:tr>
+        <w:trPr>
+          <w:trHeight w:val="895"/>
+        </w:trPr>
+        <w:tc>
+          <w:tcPr>
+            <w:tcW w:w="2969" w:type="dxa"/>
+          </w:tcPr>
+          <w:p>
+            <w:pPr>
+              <w:jc w:val="both"/>
+              <w:rPr>
+                <w:rFonts w:ascii="Arial" w:hAnsi="Arial" w:cs="Arial"/>
+              </w:rPr>
+            </w:pPr>
+            <w:r>
+              <w:rPr>
+                <w:rFonts w:ascii="Arial" w:hAnsi="Arial" w:cs="Arial"/>
+              </w:rPr>
+              <w:t>[RF0</w:t>
+            </w:r>
+            <w:r>
+              <w:rPr>
+                <w:rFonts w:ascii="Arial" w:hAnsi="Arial" w:cs="Arial"/>
+              </w:rPr>
+              <w:t>4</w:t>
+            </w:r>
+            <w:r>
+              <w:rPr>
+                <w:rFonts w:ascii="Arial" w:hAnsi="Arial" w:cs="Arial"/>
+              </w:rPr>
+              <w:t>8</w:t>
+            </w:r>
+            <w:proofErr w:type="gramStart"/>
+            <w:r>
+              <w:rPr>
+                <w:rFonts w:ascii="Arial" w:hAnsi="Arial" w:cs="Arial"/>
+              </w:rPr>
+              <w:t>] Prover</w:t>
+            </w:r>
+            <w:proofErr w:type="gramEnd"/>
+            <w:r>
+              <w:rPr>
+                <w:rFonts w:ascii="Arial" w:hAnsi="Arial" w:cs="Arial"/>
+              </w:rPr>
+              <w:t xml:space="preserve"> exibição de menu principal</w:t>
+            </w:r>
+          </w:p>
+        </w:tc>
+        <w:tc>
+          <w:tcPr>
+            <w:tcW w:w="4334" w:type="dxa"/>
+          </w:tcPr>
+          <w:p>
+            <w:pPr>
+              <w:jc w:val="both"/>
+              <w:rPr>
+                <w:rFonts w:ascii="Arial" w:hAnsi="Arial" w:cs="Arial"/>
+              </w:rPr>
+            </w:pPr>
+          </w:p>
+          <w:p>
+            <w:pPr>
+              <w:jc w:val="both"/>
+              <w:rPr>
+                <w:rFonts w:ascii="Arial" w:hAnsi="Arial" w:cs="Arial"/>
+              </w:rPr>
+            </w:pPr>
+          </w:p>
+        </w:tc>
+        <w:tc>
+          <w:tcPr>
+            <w:tcW w:w="1305" w:type="dxa"/>
+          </w:tcPr>
+          <w:p>
+            <w:pPr>
+              <w:jc w:val="both"/>
+              <w:rPr>
+                <w:rFonts w:ascii="Arial" w:hAnsi="Arial" w:cs="Arial"/>
+              </w:rPr>
+            </w:pPr>
+            <w:r>
+              <w:rPr>
+                <w:rFonts w:ascii="Arial" w:hAnsi="Arial" w:cs="Arial"/>
+              </w:rPr>
+              <w:t>Alta</w:t>
+            </w:r>
+          </w:p>
+        </w:tc>
+      </w:tr>
+      <w:tr>
+        <w:trPr>
+          <w:trHeight w:val="895"/>
+        </w:trPr>
+        <w:tc>
+          <w:tcPr>
+            <w:tcW w:w="2969" w:type="dxa"/>
+          </w:tcPr>
+          <w:p>
+            <w:pPr>
+              <w:jc w:val="both"/>
+              <w:rPr>
+                <w:rFonts w:ascii="Arial" w:hAnsi="Arial" w:cs="Arial"/>
+              </w:rPr>
+            </w:pPr>
+            <w:r>
+              <w:rPr>
+                <w:rFonts w:ascii="Arial" w:hAnsi="Arial" w:cs="Arial"/>
+              </w:rPr>
+              <w:t>[RF0</w:t>
+            </w:r>
+            <w:r>
+              <w:rPr>
+                <w:rFonts w:ascii="Arial" w:hAnsi="Arial" w:cs="Arial"/>
+              </w:rPr>
+              <w:t>49</w:t>
+            </w:r>
+            <w:proofErr w:type="gramStart"/>
+            <w:r>
+              <w:rPr>
+                <w:rFonts w:ascii="Arial" w:hAnsi="Arial" w:cs="Arial"/>
+              </w:rPr>
+              <w:t>] Prover</w:t>
+            </w:r>
+            <w:proofErr w:type="gramEnd"/>
+            <w:r>
+              <w:rPr>
+                <w:rFonts w:ascii="Arial" w:hAnsi="Arial" w:cs="Arial"/>
+              </w:rPr>
+              <w:t xml:space="preserve"> exibição de menu secundário</w:t>
             </w:r>
           </w:p>
         </w:tc>
@@ -3648,7 +5517,6 @@
   <w:style w:type="character" w:default="1" w:styleId="Fontepargpadro">
     <w:name w:val="Default Paragraph Font"/>
     <w:uiPriority w:val="1"/>
-    <w:semiHidden/>
     <w:unhideWhenUsed/>
   </w:style>
   <w:style w:type="table" w:default="1" w:styleId="Tabelanormal">

</xml_diff>